<commit_message>
buffer methods list vs buffer creation method in node.js, Kilobytes vs Kibibytes vs Bit
</commit_message>
<xml_diff>
--- a/node-js/Buffer Methods.docx
+++ b/node-js/Buffer Methods.docx
@@ -44,7 +44,7 @@
       <w:r>
         <w:t>). [</w:t>
       </w:r>
-      <w:hyperlink r:id="rId4" w:history="1">
+      <w:hyperlink r:id="rId5" w:history="1">
         <w:r>
           <w:rPr>
             <w:rStyle w:val="Hyperlink"/>
@@ -55,7 +55,7 @@
       <w:r>
         <w:t xml:space="preserve">, </w:t>
       </w:r>
-      <w:hyperlink r:id="rId5" w:history="1">
+      <w:hyperlink r:id="rId6" w:history="1">
         <w:r>
           <w:rPr>
             <w:rStyle w:val="Hyperlink"/>
@@ -66,7 +66,7 @@
       <w:r>
         <w:t xml:space="preserve">, </w:t>
       </w:r>
-      <w:hyperlink r:id="rId6" w:history="1">
+      <w:hyperlink r:id="rId7" w:history="1">
         <w:r>
           <w:rPr>
             <w:rStyle w:val="Hyperlink"/>
@@ -77,7 +77,7 @@
       <w:r>
         <w:t xml:space="preserve">, </w:t>
       </w:r>
-      <w:hyperlink r:id="rId7" w:history="1">
+      <w:hyperlink r:id="rId8" w:history="1">
         <w:r>
           <w:rPr>
             <w:rStyle w:val="Hyperlink"/>
@@ -108,7 +108,7 @@
       <w:r>
         <w:t>Used for reading, writing, and manipulating raw bytes when handling streams, networking, or file systems. [</w:t>
       </w:r>
-      <w:hyperlink r:id="rId8" w:history="1">
+      <w:hyperlink r:id="rId9" w:history="1">
         <w:r>
           <w:rPr>
             <w:rStyle w:val="Hyperlink"/>
@@ -163,7 +163,7 @@
               </w:rPr>
               <w:t>Buffer Method [</w:t>
             </w:r>
-            <w:hyperlink r:id="rId9" w:history="1">
+            <w:hyperlink r:id="rId10" w:history="1">
               <w:r>
                 <w:rPr>
                   <w:rStyle w:val="Hyperlink"/>
@@ -180,7 +180,7 @@
               </w:rPr>
               <w:t xml:space="preserve">, </w:t>
             </w:r>
-            <w:hyperlink r:id="rId10" w:history="1">
+            <w:hyperlink r:id="rId11" w:history="1">
               <w:r>
                 <w:rPr>
                   <w:rStyle w:val="Hyperlink"/>
@@ -197,7 +197,7 @@
               </w:rPr>
               <w:t xml:space="preserve">, </w:t>
             </w:r>
-            <w:hyperlink r:id="rId11" w:history="1">
+            <w:hyperlink r:id="rId12" w:history="1">
               <w:r>
                 <w:rPr>
                   <w:rStyle w:val="Hyperlink"/>
@@ -214,7 +214,7 @@
               </w:rPr>
               <w:t xml:space="preserve">, </w:t>
             </w:r>
-            <w:hyperlink r:id="rId12" w:history="1">
+            <w:hyperlink r:id="rId13" w:history="1">
               <w:r>
                 <w:rPr>
                   <w:rStyle w:val="Hyperlink"/>
@@ -231,7 +231,7 @@
               </w:rPr>
               <w:t xml:space="preserve">, </w:t>
             </w:r>
-            <w:hyperlink r:id="rId13" w:history="1">
+            <w:hyperlink r:id="rId14" w:history="1">
               <w:r>
                 <w:rPr>
                   <w:rStyle w:val="Hyperlink"/>
@@ -248,7 +248,7 @@
               </w:rPr>
               <w:t xml:space="preserve">, </w:t>
             </w:r>
-            <w:hyperlink r:id="rId14" w:history="1">
+            <w:hyperlink r:id="rId15" w:history="1">
               <w:r>
                 <w:rPr>
                   <w:rStyle w:val="Hyperlink"/>
@@ -265,7 +265,7 @@
               </w:rPr>
               <w:t xml:space="preserve">, </w:t>
             </w:r>
-            <w:hyperlink r:id="rId15" w:history="1">
+            <w:hyperlink r:id="rId16" w:history="1">
               <w:r>
                 <w:rPr>
                   <w:rStyle w:val="Hyperlink"/>
@@ -282,7 +282,7 @@
               </w:rPr>
               <w:t xml:space="preserve">, </w:t>
             </w:r>
-            <w:hyperlink r:id="rId16" w:history="1">
+            <w:hyperlink r:id="rId17" w:history="1">
               <w:r>
                 <w:rPr>
                   <w:rStyle w:val="Hyperlink"/>
@@ -299,7 +299,7 @@
               </w:rPr>
               <w:t xml:space="preserve">, </w:t>
             </w:r>
-            <w:hyperlink r:id="rId17" w:history="1">
+            <w:hyperlink r:id="rId18" w:history="1">
               <w:r>
                 <w:rPr>
                   <w:rStyle w:val="Hyperlink"/>
@@ -698,7 +698,7 @@
       <w:r>
         <w:t>Used when building or mutating large sequences of characters. [</w:t>
       </w:r>
-      <w:hyperlink r:id="rId18" w:history="1">
+      <w:hyperlink r:id="rId19" w:history="1">
         <w:r>
           <w:rPr>
             <w:rStyle w:val="Hyperlink"/>
@@ -709,7 +709,7 @@
       <w:r>
         <w:t xml:space="preserve">, </w:t>
       </w:r>
-      <w:hyperlink r:id="rId19" w:history="1">
+      <w:hyperlink r:id="rId20" w:history="1">
         <w:r>
           <w:rPr>
             <w:rStyle w:val="Hyperlink"/>
@@ -764,7 +764,7 @@
               </w:rPr>
               <w:t>Method [</w:t>
             </w:r>
-            <w:hyperlink r:id="rId20" w:history="1">
+            <w:hyperlink r:id="rId21" w:history="1">
               <w:r>
                 <w:rPr>
                   <w:rStyle w:val="Hyperlink"/>
@@ -781,7 +781,7 @@
               </w:rPr>
               <w:t xml:space="preserve">, </w:t>
             </w:r>
-            <w:hyperlink r:id="rId21" w:history="1">
+            <w:hyperlink r:id="rId22" w:history="1">
               <w:r>
                 <w:rPr>
                   <w:rStyle w:val="Hyperlink"/>
@@ -798,7 +798,7 @@
               </w:rPr>
               <w:t xml:space="preserve">, </w:t>
             </w:r>
-            <w:hyperlink r:id="rId22" w:history="1">
+            <w:hyperlink r:id="rId23" w:history="1">
               <w:r>
                 <w:rPr>
                   <w:rStyle w:val="Hyperlink"/>
@@ -815,7 +815,7 @@
               </w:rPr>
               <w:t xml:space="preserve">, </w:t>
             </w:r>
-            <w:hyperlink r:id="rId23" w:history="1">
+            <w:hyperlink r:id="rId24" w:history="1">
               <w:r>
                 <w:rPr>
                   <w:rStyle w:val="Hyperlink"/>
@@ -1154,6 +1154,1622 @@
       </w:r>
     </w:p>
     <w:p/>
+    <w:p>
+      <w:pPr>
+        <w:pBdr>
+          <w:bottom w:val="dotted" w:sz="24" w:space="1" w:color="auto"/>
+        </w:pBdr>
+      </w:pPr>
+    </w:p>
+    <w:p/>
+    <w:p>
+      <w:pPr>
+        <w:jc w:val="center"/>
+        <w:rPr>
+          <w:b/>
+          <w:bCs/>
+          <w:sz w:val="32"/>
+          <w:szCs w:val="32"/>
+        </w:rPr>
+      </w:pPr>
+      <w:r>
+        <w:rPr>
+          <w:b/>
+          <w:bCs/>
+          <w:sz w:val="32"/>
+          <w:szCs w:val="32"/>
+        </w:rPr>
+        <w:t xml:space="preserve">buffer methods list vs buffer creation method in node </w:t>
+      </w:r>
+      <w:proofErr w:type="spellStart"/>
+      <w:r>
+        <w:rPr>
+          <w:b/>
+          <w:bCs/>
+          <w:sz w:val="32"/>
+          <w:szCs w:val="32"/>
+        </w:rPr>
+        <w:t>js</w:t>
+      </w:r>
+      <w:proofErr w:type="spellEnd"/>
+    </w:p>
+    <w:p>
+      <w:pPr>
+        <w:jc w:val="center"/>
+        <w:rPr>
+          <w:b/>
+          <w:bCs/>
+        </w:rPr>
+      </w:pPr>
+      <w:r>
+        <w:rPr>
+          <w:b/>
+          <w:bCs/>
+        </w:rPr>
+        <w:t>(</w:t>
+      </w:r>
+      <w:r>
+        <w:rPr>
+          <w:b/>
+          <w:bCs/>
+        </w:rPr>
+        <w:t xml:space="preserve">buffer methods list vs buffer creation method in node </w:t>
+      </w:r>
+      <w:proofErr w:type="spellStart"/>
+      <w:r>
+        <w:rPr>
+          <w:b/>
+          <w:bCs/>
+        </w:rPr>
+        <w:t>js</w:t>
+      </w:r>
+      <w:proofErr w:type="spellEnd"/>
+      <w:r>
+        <w:rPr>
+          <w:b/>
+          <w:bCs/>
+        </w:rPr>
+        <w:t xml:space="preserve"> – google - ss)</w:t>
+      </w:r>
+    </w:p>
+    <w:p>
+      <w:r>
+        <w:t xml:space="preserve">The primary difference is that </w:t>
+      </w:r>
+      <w:r>
+        <w:rPr>
+          <w:b/>
+          <w:bCs/>
+        </w:rPr>
+        <w:t>buffer creation methods</w:t>
+      </w:r>
+      <w:r>
+        <w:t xml:space="preserve"> are static class methods used to generate new memory allocations, while the </w:t>
+      </w:r>
+      <w:r>
+        <w:rPr>
+          <w:b/>
+          <w:bCs/>
+        </w:rPr>
+        <w:t>buffer methods list</w:t>
+      </w:r>
+      <w:r>
+        <w:t xml:space="preserve"> refers to instance methods used to manipulate, read, or convert an already existing buffer object. [</w:t>
+      </w:r>
+      <w:hyperlink r:id="rId25" w:history="1">
+        <w:r>
+          <w:rPr>
+            <w:rStyle w:val="Hyperlink"/>
+          </w:rPr>
+          <w:t>1</w:t>
+        </w:r>
+      </w:hyperlink>
+      <w:r>
+        <w:t xml:space="preserve">, </w:t>
+      </w:r>
+      <w:hyperlink r:id="rId26" w:history="1">
+        <w:r>
+          <w:rPr>
+            <w:rStyle w:val="Hyperlink"/>
+          </w:rPr>
+          <w:t>2</w:t>
+        </w:r>
+      </w:hyperlink>
+      <w:r>
+        <w:t xml:space="preserve">, </w:t>
+      </w:r>
+      <w:hyperlink r:id="rId27" w:history="1">
+        <w:r>
+          <w:rPr>
+            <w:rStyle w:val="Hyperlink"/>
+          </w:rPr>
+          <w:t>3</w:t>
+        </w:r>
+      </w:hyperlink>
+      <w:r>
+        <w:t>]</w:t>
+      </w:r>
+    </w:p>
+    <w:p>
+      <w:r>
+        <w:pict w14:anchorId="3F616D48">
+          <v:rect id="_x0000_i1049" style="width:0;height:1.5pt" o:hralign="center" o:hrstd="t" o:hr="t" fillcolor="#a0a0a0" stroked="f"/>
+        </w:pict>
+      </w:r>
+    </w:p>
+    <w:p>
+      <w:pPr>
+        <w:rPr>
+          <w:b/>
+          <w:bCs/>
+        </w:rPr>
+      </w:pPr>
+      <w:r>
+        <w:rPr>
+          <w:b/>
+          <w:bCs/>
+        </w:rPr>
+        <w:t>Direct Overview</w:t>
+      </w:r>
+    </w:p>
+    <w:tbl>
+      <w:tblPr>
+        <w:tblW w:w="0" w:type="auto"/>
+        <w:tblCellSpacing w:w="15" w:type="dxa"/>
+        <w:tblCellMar>
+          <w:top w:w="15" w:type="dxa"/>
+          <w:left w:w="15" w:type="dxa"/>
+          <w:bottom w:w="15" w:type="dxa"/>
+          <w:right w:w="15" w:type="dxa"/>
+        </w:tblCellMar>
+        <w:tblLook w:val="04A0" w:firstRow="1" w:lastRow="0" w:firstColumn="1" w:lastColumn="0" w:noHBand="0" w:noVBand="1"/>
+      </w:tblPr>
+      <w:tblGrid>
+        <w:gridCol w:w="1878"/>
+        <w:gridCol w:w="3447"/>
+        <w:gridCol w:w="4035"/>
+      </w:tblGrid>
+      <w:tr>
+        <w:trPr>
+          <w:tblCellSpacing w:w="15" w:type="dxa"/>
+        </w:trPr>
+        <w:tc>
+          <w:tcPr>
+            <w:tcW w:w="0" w:type="auto"/>
+            <w:tcBorders>
+              <w:bottom w:val="single" w:sz="4" w:space="0" w:color="D2D2D2"/>
+            </w:tcBorders>
+            <w:vAlign w:val="center"/>
+            <w:hideMark/>
+          </w:tcPr>
+          <w:p>
+            <w:pPr>
+              <w:rPr>
+                <w:b/>
+                <w:bCs/>
+              </w:rPr>
+            </w:pPr>
+            <w:r>
+              <w:rPr>
+                <w:b/>
+                <w:bCs/>
+              </w:rPr>
+              <w:t>Feature [</w:t>
+            </w:r>
+            <w:hyperlink r:id="rId28" w:history="1">
+              <w:r>
+                <w:rPr>
+                  <w:rStyle w:val="Hyperlink"/>
+                  <w:b/>
+                  <w:bCs/>
+                </w:rPr>
+                <w:t>1</w:t>
+              </w:r>
+            </w:hyperlink>
+            <w:r>
+              <w:rPr>
+                <w:b/>
+                <w:bCs/>
+              </w:rPr>
+              <w:t xml:space="preserve">, </w:t>
+            </w:r>
+            <w:hyperlink r:id="rId29" w:history="1">
+              <w:r>
+                <w:rPr>
+                  <w:rStyle w:val="Hyperlink"/>
+                  <w:b/>
+                  <w:bCs/>
+                </w:rPr>
+                <w:t>2</w:t>
+              </w:r>
+            </w:hyperlink>
+            <w:r>
+              <w:rPr>
+                <w:b/>
+                <w:bCs/>
+              </w:rPr>
+              <w:t xml:space="preserve">, </w:t>
+            </w:r>
+            <w:hyperlink r:id="rId30" w:history="1">
+              <w:r>
+                <w:rPr>
+                  <w:rStyle w:val="Hyperlink"/>
+                  <w:b/>
+                  <w:bCs/>
+                </w:rPr>
+                <w:t>3</w:t>
+              </w:r>
+            </w:hyperlink>
+            <w:r>
+              <w:rPr>
+                <w:b/>
+                <w:bCs/>
+              </w:rPr>
+              <w:t xml:space="preserve">, </w:t>
+            </w:r>
+            <w:hyperlink r:id="rId31" w:history="1">
+              <w:r>
+                <w:rPr>
+                  <w:rStyle w:val="Hyperlink"/>
+                  <w:b/>
+                  <w:bCs/>
+                </w:rPr>
+                <w:t>4</w:t>
+              </w:r>
+            </w:hyperlink>
+            <w:r>
+              <w:rPr>
+                <w:b/>
+                <w:bCs/>
+              </w:rPr>
+              <w:t xml:space="preserve">, </w:t>
+            </w:r>
+            <w:hyperlink r:id="rId32" w:history="1">
+              <w:r>
+                <w:rPr>
+                  <w:rStyle w:val="Hyperlink"/>
+                  <w:b/>
+                  <w:bCs/>
+                </w:rPr>
+                <w:t>5</w:t>
+              </w:r>
+            </w:hyperlink>
+            <w:r>
+              <w:rPr>
+                <w:b/>
+                <w:bCs/>
+              </w:rPr>
+              <w:t>]</w:t>
+            </w:r>
+          </w:p>
+        </w:tc>
+        <w:tc>
+          <w:tcPr>
+            <w:tcW w:w="0" w:type="auto"/>
+            <w:tcBorders>
+              <w:bottom w:val="single" w:sz="4" w:space="0" w:color="D2D2D2"/>
+            </w:tcBorders>
+            <w:vAlign w:val="center"/>
+            <w:hideMark/>
+          </w:tcPr>
+          <w:p>
+            <w:pPr>
+              <w:rPr>
+                <w:b/>
+                <w:bCs/>
+              </w:rPr>
+            </w:pPr>
+            <w:r>
+              <w:rPr>
+                <w:b/>
+                <w:bCs/>
+              </w:rPr>
+              <w:t>Buffer Creation Methods (Static)</w:t>
+            </w:r>
+          </w:p>
+        </w:tc>
+        <w:tc>
+          <w:tcPr>
+            <w:tcW w:w="0" w:type="auto"/>
+            <w:tcBorders>
+              <w:bottom w:val="single" w:sz="4" w:space="0" w:color="D2D2D2"/>
+            </w:tcBorders>
+            <w:vAlign w:val="center"/>
+            <w:hideMark/>
+          </w:tcPr>
+          <w:p>
+            <w:pPr>
+              <w:rPr>
+                <w:b/>
+                <w:bCs/>
+              </w:rPr>
+            </w:pPr>
+            <w:r>
+              <w:rPr>
+                <w:b/>
+                <w:bCs/>
+              </w:rPr>
+              <w:t>Buffer Manipulation Methods (Instance)</w:t>
+            </w:r>
+          </w:p>
+        </w:tc>
+      </w:tr>
+      <w:tr>
+        <w:trPr>
+          <w:tblCellSpacing w:w="15" w:type="dxa"/>
+        </w:trPr>
+        <w:tc>
+          <w:tcPr>
+            <w:tcW w:w="0" w:type="auto"/>
+            <w:tcBorders>
+              <w:bottom w:val="single" w:sz="4" w:space="0" w:color="D2D2D2"/>
+            </w:tcBorders>
+            <w:vAlign w:val="center"/>
+            <w:hideMark/>
+          </w:tcPr>
+          <w:p>
+            <w:r>
+              <w:rPr>
+                <w:b/>
+                <w:bCs/>
+              </w:rPr>
+              <w:t>Target</w:t>
+            </w:r>
+          </w:p>
+        </w:tc>
+        <w:tc>
+          <w:tcPr>
+            <w:tcW w:w="0" w:type="auto"/>
+            <w:tcBorders>
+              <w:bottom w:val="single" w:sz="4" w:space="0" w:color="D2D2D2"/>
+            </w:tcBorders>
+            <w:vAlign w:val="center"/>
+            <w:hideMark/>
+          </w:tcPr>
+          <w:p>
+            <w:r>
+              <w:t>Called on the global Buffer class itself.</w:t>
+            </w:r>
+          </w:p>
+        </w:tc>
+        <w:tc>
+          <w:tcPr>
+            <w:tcW w:w="0" w:type="auto"/>
+            <w:tcBorders>
+              <w:bottom w:val="single" w:sz="4" w:space="0" w:color="D2D2D2"/>
+            </w:tcBorders>
+            <w:vAlign w:val="center"/>
+            <w:hideMark/>
+          </w:tcPr>
+          <w:p>
+            <w:r>
+              <w:t xml:space="preserve">Called on an instantiated buffer object (e.g., </w:t>
+            </w:r>
+            <w:proofErr w:type="spellStart"/>
+            <w:r>
+              <w:t>buf</w:t>
+            </w:r>
+            <w:proofErr w:type="spellEnd"/>
+            <w:r>
+              <w:t>).</w:t>
+            </w:r>
+          </w:p>
+        </w:tc>
+      </w:tr>
+      <w:tr>
+        <w:trPr>
+          <w:tblCellSpacing w:w="15" w:type="dxa"/>
+        </w:trPr>
+        <w:tc>
+          <w:tcPr>
+            <w:tcW w:w="0" w:type="auto"/>
+            <w:tcBorders>
+              <w:bottom w:val="single" w:sz="4" w:space="0" w:color="D2D2D2"/>
+            </w:tcBorders>
+            <w:vAlign w:val="center"/>
+            <w:hideMark/>
+          </w:tcPr>
+          <w:p>
+            <w:r>
+              <w:rPr>
+                <w:b/>
+                <w:bCs/>
+              </w:rPr>
+              <w:lastRenderedPageBreak/>
+              <w:t>Primary Goal</w:t>
+            </w:r>
+          </w:p>
+        </w:tc>
+        <w:tc>
+          <w:tcPr>
+            <w:tcW w:w="0" w:type="auto"/>
+            <w:tcBorders>
+              <w:bottom w:val="single" w:sz="4" w:space="0" w:color="D2D2D2"/>
+            </w:tcBorders>
+            <w:vAlign w:val="center"/>
+            <w:hideMark/>
+          </w:tcPr>
+          <w:p>
+            <w:r>
+              <w:t>Allocate memory and initialize binary data.</w:t>
+            </w:r>
+          </w:p>
+        </w:tc>
+        <w:tc>
+          <w:tcPr>
+            <w:tcW w:w="0" w:type="auto"/>
+            <w:tcBorders>
+              <w:bottom w:val="single" w:sz="4" w:space="0" w:color="D2D2D2"/>
+            </w:tcBorders>
+            <w:vAlign w:val="center"/>
+            <w:hideMark/>
+          </w:tcPr>
+          <w:p>
+            <w:r>
+              <w:t>Read, modify, convert, or slice existing binary data.</w:t>
+            </w:r>
+          </w:p>
+        </w:tc>
+      </w:tr>
+      <w:tr>
+        <w:trPr>
+          <w:tblCellSpacing w:w="15" w:type="dxa"/>
+        </w:trPr>
+        <w:tc>
+          <w:tcPr>
+            <w:tcW w:w="0" w:type="auto"/>
+            <w:tcBorders>
+              <w:bottom w:val="nil"/>
+            </w:tcBorders>
+            <w:vAlign w:val="center"/>
+            <w:hideMark/>
+          </w:tcPr>
+          <w:p>
+            <w:r>
+              <w:rPr>
+                <w:b/>
+                <w:bCs/>
+              </w:rPr>
+              <w:t>Examples</w:t>
+            </w:r>
+          </w:p>
+        </w:tc>
+        <w:tc>
+          <w:tcPr>
+            <w:tcW w:w="0" w:type="auto"/>
+            <w:tcBorders>
+              <w:bottom w:val="nil"/>
+            </w:tcBorders>
+            <w:vAlign w:val="center"/>
+            <w:hideMark/>
+          </w:tcPr>
+          <w:p>
+            <w:proofErr w:type="spellStart"/>
+            <w:r>
+              <w:t>Buffer.alloc</w:t>
+            </w:r>
+            <w:proofErr w:type="spellEnd"/>
+            <w:r>
+              <w:t xml:space="preserve">(), </w:t>
+            </w:r>
+            <w:proofErr w:type="spellStart"/>
+            <w:r>
+              <w:t>Buffer.from</w:t>
+            </w:r>
+            <w:proofErr w:type="spellEnd"/>
+            <w:r>
+              <w:t>()</w:t>
+            </w:r>
+          </w:p>
+        </w:tc>
+        <w:tc>
+          <w:tcPr>
+            <w:tcW w:w="0" w:type="auto"/>
+            <w:tcBorders>
+              <w:bottom w:val="nil"/>
+            </w:tcBorders>
+            <w:vAlign w:val="center"/>
+            <w:hideMark/>
+          </w:tcPr>
+          <w:p>
+            <w:proofErr w:type="spellStart"/>
+            <w:proofErr w:type="gramStart"/>
+            <w:r>
+              <w:t>buf.toString</w:t>
+            </w:r>
+            <w:proofErr w:type="spellEnd"/>
+            <w:proofErr w:type="gramEnd"/>
+            <w:r>
+              <w:t xml:space="preserve">(), </w:t>
+            </w:r>
+            <w:proofErr w:type="spellStart"/>
+            <w:proofErr w:type="gramStart"/>
+            <w:r>
+              <w:t>buf.write</w:t>
+            </w:r>
+            <w:proofErr w:type="spellEnd"/>
+            <w:proofErr w:type="gramEnd"/>
+            <w:r>
+              <w:t xml:space="preserve">(), </w:t>
+            </w:r>
+            <w:proofErr w:type="spellStart"/>
+            <w:proofErr w:type="gramStart"/>
+            <w:r>
+              <w:t>buf.slice</w:t>
+            </w:r>
+            <w:proofErr w:type="spellEnd"/>
+            <w:proofErr w:type="gramEnd"/>
+            <w:r>
+              <w:t>()</w:t>
+            </w:r>
+          </w:p>
+        </w:tc>
+      </w:tr>
+    </w:tbl>
+    <w:p>
+      <w:r>
+        <w:pict w14:anchorId="17AA4BD5">
+          <v:rect id="_x0000_i1050" style="width:0;height:1.5pt" o:hralign="center" o:hrstd="t" o:hr="t" fillcolor="#a0a0a0" stroked="f"/>
+        </w:pict>
+      </w:r>
+    </w:p>
+    <w:p>
+      <w:pPr>
+        <w:rPr>
+          <w:b/>
+          <w:bCs/>
+        </w:rPr>
+      </w:pPr>
+      <w:r>
+        <w:rPr>
+          <w:b/>
+          <w:bCs/>
+        </w:rPr>
+        <w:t>Buffer Creation Methods</w:t>
+      </w:r>
+    </w:p>
+    <w:p>
+      <w:r>
+        <w:t>These static methods are exposed directly by the Buffer class. They allocate raw memory or clone incoming data types into the Node.js runtime. [</w:t>
+      </w:r>
+      <w:hyperlink r:id="rId33" w:history="1">
+        <w:r>
+          <w:rPr>
+            <w:rStyle w:val="Hyperlink"/>
+          </w:rPr>
+          <w:t>1</w:t>
+        </w:r>
+      </w:hyperlink>
+      <w:r>
+        <w:t xml:space="preserve">, </w:t>
+      </w:r>
+      <w:hyperlink r:id="rId34" w:history="1">
+        <w:r>
+          <w:rPr>
+            <w:rStyle w:val="Hyperlink"/>
+          </w:rPr>
+          <w:t>2</w:t>
+        </w:r>
+      </w:hyperlink>
+      <w:r>
+        <w:t xml:space="preserve">, </w:t>
+      </w:r>
+      <w:hyperlink r:id="rId35" w:history="1">
+        <w:r>
+          <w:rPr>
+            <w:rStyle w:val="Hyperlink"/>
+          </w:rPr>
+          <w:t>3</w:t>
+        </w:r>
+      </w:hyperlink>
+      <w:r>
+        <w:t xml:space="preserve">, </w:t>
+      </w:r>
+      <w:hyperlink r:id="rId36" w:history="1">
+        <w:r>
+          <w:rPr>
+            <w:rStyle w:val="Hyperlink"/>
+          </w:rPr>
+          <w:t>4</w:t>
+        </w:r>
+      </w:hyperlink>
+      <w:r>
+        <w:t xml:space="preserve">, </w:t>
+      </w:r>
+      <w:hyperlink r:id="rId37" w:history="1">
+        <w:r>
+          <w:rPr>
+            <w:rStyle w:val="Hyperlink"/>
+          </w:rPr>
+          <w:t>5</w:t>
+        </w:r>
+      </w:hyperlink>
+      <w:r>
+        <w:t>]</w:t>
+      </w:r>
+    </w:p>
+    <w:p>
+      <w:pPr>
+        <w:numPr>
+          <w:ilvl w:val="0"/>
+          <w:numId w:val="1"/>
+        </w:numPr>
+      </w:pPr>
+      <w:proofErr w:type="spellStart"/>
+      <w:r>
+        <w:rPr>
+          <w:b/>
+          <w:bCs/>
+        </w:rPr>
+        <w:t>Buffer.alloc</w:t>
+      </w:r>
+      <w:proofErr w:type="spellEnd"/>
+      <w:r>
+        <w:rPr>
+          <w:b/>
+          <w:bCs/>
+        </w:rPr>
+        <w:t>(</w:t>
+      </w:r>
+      <w:proofErr w:type="gramStart"/>
+      <w:r>
+        <w:rPr>
+          <w:b/>
+          <w:bCs/>
+        </w:rPr>
+        <w:t>size[</w:t>
+      </w:r>
+      <w:proofErr w:type="gramEnd"/>
+      <w:r>
+        <w:rPr>
+          <w:b/>
+          <w:bCs/>
+        </w:rPr>
+        <w:t xml:space="preserve">, </w:t>
+      </w:r>
+      <w:proofErr w:type="gramStart"/>
+      <w:r>
+        <w:rPr>
+          <w:b/>
+          <w:bCs/>
+        </w:rPr>
+        <w:t>fill[</w:t>
+      </w:r>
+      <w:proofErr w:type="gramEnd"/>
+      <w:r>
+        <w:rPr>
+          <w:b/>
+          <w:bCs/>
+        </w:rPr>
+        <w:t>, encoding]])</w:t>
+      </w:r>
+      <w:r>
+        <w:t>: Allocates a clean, zero-filled buffer of a specified size. This is the safest way to initialize a buffer.</w:t>
+      </w:r>
+    </w:p>
+    <w:p>
+      <w:pPr>
+        <w:numPr>
+          <w:ilvl w:val="0"/>
+          <w:numId w:val="1"/>
+        </w:numPr>
+      </w:pPr>
+      <w:proofErr w:type="spellStart"/>
+      <w:r>
+        <w:rPr>
+          <w:b/>
+          <w:bCs/>
+        </w:rPr>
+        <w:t>Buffer.allocUnsafe</w:t>
+      </w:r>
+      <w:proofErr w:type="spellEnd"/>
+      <w:r>
+        <w:rPr>
+          <w:b/>
+          <w:bCs/>
+        </w:rPr>
+        <w:t>(size)</w:t>
+      </w:r>
+      <w:r>
+        <w:t xml:space="preserve">: Allocates a raw chunk of memory of the specified size. It is faster than </w:t>
+      </w:r>
+      <w:proofErr w:type="spellStart"/>
+      <w:r>
+        <w:t>alloc</w:t>
+      </w:r>
+      <w:proofErr w:type="spellEnd"/>
+      <w:r>
+        <w:t xml:space="preserve"> but contains "dirty" leftover data from previously destroyed memory segments.</w:t>
+      </w:r>
+    </w:p>
+    <w:p>
+      <w:pPr>
+        <w:numPr>
+          <w:ilvl w:val="0"/>
+          <w:numId w:val="1"/>
+        </w:numPr>
+      </w:pPr>
+      <w:proofErr w:type="spellStart"/>
+      <w:r>
+        <w:rPr>
+          <w:b/>
+          <w:bCs/>
+        </w:rPr>
+        <w:t>Buffer.from</w:t>
+      </w:r>
+      <w:proofErr w:type="spellEnd"/>
+      <w:r>
+        <w:rPr>
+          <w:b/>
+          <w:bCs/>
+        </w:rPr>
+        <w:t xml:space="preserve">(array | string | buffer | </w:t>
+      </w:r>
+      <w:proofErr w:type="spellStart"/>
+      <w:r>
+        <w:rPr>
+          <w:b/>
+          <w:bCs/>
+        </w:rPr>
+        <w:t>arrayBuffer</w:t>
+      </w:r>
+      <w:proofErr w:type="spellEnd"/>
+      <w:r>
+        <w:rPr>
+          <w:b/>
+          <w:bCs/>
+        </w:rPr>
+        <w:t>)</w:t>
+      </w:r>
+      <w:r>
+        <w:t>: Creates a new buffer populated with a copy of the passed data type (such as transforming a standard string into raw bytes).</w:t>
+      </w:r>
+    </w:p>
+    <w:p>
+      <w:pPr>
+        <w:numPr>
+          <w:ilvl w:val="0"/>
+          <w:numId w:val="1"/>
+        </w:numPr>
+      </w:pPr>
+      <w:proofErr w:type="spellStart"/>
+      <w:r>
+        <w:rPr>
+          <w:b/>
+          <w:bCs/>
+        </w:rPr>
+        <w:t>Buffer.concat</w:t>
+      </w:r>
+      <w:proofErr w:type="spellEnd"/>
+      <w:r>
+        <w:rPr>
+          <w:b/>
+          <w:bCs/>
+        </w:rPr>
+        <w:t>(</w:t>
+      </w:r>
+      <w:proofErr w:type="gramStart"/>
+      <w:r>
+        <w:rPr>
+          <w:b/>
+          <w:bCs/>
+        </w:rPr>
+        <w:t>list[</w:t>
+      </w:r>
+      <w:proofErr w:type="gramEnd"/>
+      <w:r>
+        <w:rPr>
+          <w:b/>
+          <w:bCs/>
+        </w:rPr>
+        <w:t xml:space="preserve">, </w:t>
+      </w:r>
+      <w:proofErr w:type="spellStart"/>
+      <w:r>
+        <w:rPr>
+          <w:b/>
+          <w:bCs/>
+        </w:rPr>
+        <w:t>totalLength</w:t>
+      </w:r>
+      <w:proofErr w:type="spellEnd"/>
+      <w:r>
+        <w:rPr>
+          <w:b/>
+          <w:bCs/>
+        </w:rPr>
+        <w:t>])</w:t>
+      </w:r>
+      <w:r>
+        <w:t>: Takes an array of existing buffers and merges them into one single new buffer. [</w:t>
+      </w:r>
+      <w:hyperlink r:id="rId38" w:history="1">
+        <w:r>
+          <w:rPr>
+            <w:rStyle w:val="Hyperlink"/>
+          </w:rPr>
+          <w:t>1</w:t>
+        </w:r>
+      </w:hyperlink>
+      <w:r>
+        <w:t xml:space="preserve">, </w:t>
+      </w:r>
+      <w:hyperlink r:id="rId39" w:history="1">
+        <w:r>
+          <w:rPr>
+            <w:rStyle w:val="Hyperlink"/>
+          </w:rPr>
+          <w:t>2</w:t>
+        </w:r>
+      </w:hyperlink>
+      <w:r>
+        <w:t xml:space="preserve">, </w:t>
+      </w:r>
+      <w:hyperlink r:id="rId40" w:history="1">
+        <w:r>
+          <w:rPr>
+            <w:rStyle w:val="Hyperlink"/>
+          </w:rPr>
+          <w:t>3</w:t>
+        </w:r>
+      </w:hyperlink>
+      <w:r>
+        <w:t xml:space="preserve">, </w:t>
+      </w:r>
+      <w:hyperlink r:id="rId41" w:history="1">
+        <w:r>
+          <w:rPr>
+            <w:rStyle w:val="Hyperlink"/>
+          </w:rPr>
+          <w:t>4</w:t>
+        </w:r>
+      </w:hyperlink>
+      <w:r>
+        <w:t xml:space="preserve">, </w:t>
+      </w:r>
+      <w:hyperlink r:id="rId42" w:history="1">
+        <w:r>
+          <w:rPr>
+            <w:rStyle w:val="Hyperlink"/>
+          </w:rPr>
+          <w:t>5</w:t>
+        </w:r>
+      </w:hyperlink>
+      <w:r>
+        <w:t xml:space="preserve">, </w:t>
+      </w:r>
+      <w:hyperlink r:id="rId43" w:history="1">
+        <w:r>
+          <w:rPr>
+            <w:rStyle w:val="Hyperlink"/>
+          </w:rPr>
+          <w:t>6</w:t>
+        </w:r>
+      </w:hyperlink>
+      <w:r>
+        <w:t>]</w:t>
+      </w:r>
+    </w:p>
+    <w:p>
+      <w:r>
+        <w:pict w14:anchorId="7B2BFAB3">
+          <v:rect id="_x0000_i1051" style="width:0;height:1.5pt" o:hralign="center" o:hrstd="t" o:hr="t" fillcolor="#a0a0a0" stroked="f"/>
+        </w:pict>
+      </w:r>
+    </w:p>
+    <w:p>
+      <w:pPr>
+        <w:rPr>
+          <w:b/>
+          <w:bCs/>
+        </w:rPr>
+      </w:pPr>
+      <w:r>
+        <w:rPr>
+          <w:b/>
+          <w:bCs/>
+        </w:rPr>
+        <w:t>Buffer Instance Methods List</w:t>
+      </w:r>
+    </w:p>
+    <w:p>
+      <w:r>
+        <w:t xml:space="preserve">Once a buffer is initialized, it inherits instance properties and methods via the </w:t>
+      </w:r>
+      <w:hyperlink r:id="rId44" w:tgtFrame="_blank" w:history="1">
+        <w:r>
+          <w:rPr>
+            <w:rStyle w:val="Hyperlink"/>
+          </w:rPr>
+          <w:t>Node.js Buffer Prototype</w:t>
+        </w:r>
+      </w:hyperlink>
+      <w:r>
+        <w:t>. These are used to interact with the raw memory bytes. [</w:t>
+      </w:r>
+      <w:hyperlink r:id="rId45" w:history="1">
+        <w:r>
+          <w:rPr>
+            <w:rStyle w:val="Hyperlink"/>
+          </w:rPr>
+          <w:t>1</w:t>
+        </w:r>
+      </w:hyperlink>
+      <w:r>
+        <w:t xml:space="preserve">, </w:t>
+      </w:r>
+      <w:hyperlink r:id="rId46" w:history="1">
+        <w:r>
+          <w:rPr>
+            <w:rStyle w:val="Hyperlink"/>
+          </w:rPr>
+          <w:t>2</w:t>
+        </w:r>
+      </w:hyperlink>
+      <w:r>
+        <w:t xml:space="preserve">, </w:t>
+      </w:r>
+      <w:hyperlink r:id="rId47" w:history="1">
+        <w:r>
+          <w:rPr>
+            <w:rStyle w:val="Hyperlink"/>
+          </w:rPr>
+          <w:t>3</w:t>
+        </w:r>
+      </w:hyperlink>
+      <w:r>
+        <w:t xml:space="preserve">, </w:t>
+      </w:r>
+      <w:hyperlink r:id="rId48" w:history="1">
+        <w:r>
+          <w:rPr>
+            <w:rStyle w:val="Hyperlink"/>
+          </w:rPr>
+          <w:t>4</w:t>
+        </w:r>
+      </w:hyperlink>
+      <w:r>
+        <w:t>]</w:t>
+      </w:r>
+    </w:p>
+    <w:p>
+      <w:pPr>
+        <w:rPr>
+          <w:b/>
+          <w:bCs/>
+        </w:rPr>
+      </w:pPr>
+      <w:r>
+        <w:rPr>
+          <w:b/>
+          <w:bCs/>
+        </w:rPr>
+        <w:t>Reading and Writing Data</w:t>
+      </w:r>
+    </w:p>
+    <w:p>
+      <w:pPr>
+        <w:numPr>
+          <w:ilvl w:val="0"/>
+          <w:numId w:val="2"/>
+        </w:numPr>
+      </w:pPr>
+      <w:proofErr w:type="spellStart"/>
+      <w:proofErr w:type="gramStart"/>
+      <w:r>
+        <w:rPr>
+          <w:b/>
+          <w:bCs/>
+        </w:rPr>
+        <w:t>buf.write</w:t>
+      </w:r>
+      <w:proofErr w:type="spellEnd"/>
+      <w:proofErr w:type="gramEnd"/>
+      <w:r>
+        <w:rPr>
+          <w:b/>
+          <w:bCs/>
+        </w:rPr>
+        <w:t>(</w:t>
+      </w:r>
+      <w:proofErr w:type="gramStart"/>
+      <w:r>
+        <w:rPr>
+          <w:b/>
+          <w:bCs/>
+        </w:rPr>
+        <w:t>string[</w:t>
+      </w:r>
+      <w:proofErr w:type="gramEnd"/>
+      <w:r>
+        <w:rPr>
+          <w:b/>
+          <w:bCs/>
+        </w:rPr>
+        <w:t xml:space="preserve">, </w:t>
+      </w:r>
+      <w:proofErr w:type="gramStart"/>
+      <w:r>
+        <w:rPr>
+          <w:b/>
+          <w:bCs/>
+        </w:rPr>
+        <w:t>offset[</w:t>
+      </w:r>
+      <w:proofErr w:type="gramEnd"/>
+      <w:r>
+        <w:rPr>
+          <w:b/>
+          <w:bCs/>
+        </w:rPr>
+        <w:t>, length</w:t>
+      </w:r>
+      <w:proofErr w:type="gramStart"/>
+      <w:r>
+        <w:rPr>
+          <w:b/>
+          <w:bCs/>
+        </w:rPr>
+        <w:t>]][</w:t>
+      </w:r>
+      <w:proofErr w:type="gramEnd"/>
+      <w:r>
+        <w:rPr>
+          <w:b/>
+          <w:bCs/>
+        </w:rPr>
+        <w:t>, encoding])</w:t>
+      </w:r>
+      <w:r>
+        <w:t>: Writes a string of characters directly into an existing buffer at a specified starting byte.</w:t>
+      </w:r>
+    </w:p>
+    <w:p>
+      <w:pPr>
+        <w:numPr>
+          <w:ilvl w:val="0"/>
+          <w:numId w:val="2"/>
+        </w:numPr>
+      </w:pPr>
+      <w:proofErr w:type="spellStart"/>
+      <w:proofErr w:type="gramStart"/>
+      <w:r>
+        <w:rPr>
+          <w:b/>
+          <w:bCs/>
+        </w:rPr>
+        <w:t>buf.toString</w:t>
+      </w:r>
+      <w:proofErr w:type="spellEnd"/>
+      <w:proofErr w:type="gramEnd"/>
+      <w:r>
+        <w:rPr>
+          <w:b/>
+          <w:bCs/>
+        </w:rPr>
+        <w:t>([</w:t>
+      </w:r>
+      <w:proofErr w:type="gramStart"/>
+      <w:r>
+        <w:rPr>
+          <w:b/>
+          <w:bCs/>
+        </w:rPr>
+        <w:t>encoding[</w:t>
+      </w:r>
+      <w:proofErr w:type="gramEnd"/>
+      <w:r>
+        <w:rPr>
+          <w:b/>
+          <w:bCs/>
+        </w:rPr>
+        <w:t xml:space="preserve">, </w:t>
+      </w:r>
+      <w:proofErr w:type="gramStart"/>
+      <w:r>
+        <w:rPr>
+          <w:b/>
+          <w:bCs/>
+        </w:rPr>
+        <w:t>start[</w:t>
+      </w:r>
+      <w:proofErr w:type="gramEnd"/>
+      <w:r>
+        <w:rPr>
+          <w:b/>
+          <w:bCs/>
+        </w:rPr>
+        <w:t xml:space="preserve">, </w:t>
+      </w:r>
+      <w:proofErr w:type="gramStart"/>
+      <w:r>
+        <w:rPr>
+          <w:b/>
+          <w:bCs/>
+        </w:rPr>
+        <w:t>end]]</w:t>
+      </w:r>
+      <w:proofErr w:type="gramEnd"/>
+      <w:r>
+        <w:rPr>
+          <w:b/>
+          <w:bCs/>
+        </w:rPr>
+        <w:t>])</w:t>
+      </w:r>
+      <w:r>
+        <w:t>: Decodes the buffer's binary contents back into a human-readable string layout.</w:t>
+      </w:r>
+    </w:p>
+    <w:p>
+      <w:pPr>
+        <w:numPr>
+          <w:ilvl w:val="0"/>
+          <w:numId w:val="2"/>
+        </w:numPr>
+      </w:pPr>
+      <w:proofErr w:type="gramStart"/>
+      <w:r>
+        <w:rPr>
+          <w:b/>
+          <w:bCs/>
+        </w:rPr>
+        <w:t>buf.readInt</w:t>
+      </w:r>
+      <w:proofErr w:type="gramEnd"/>
+      <w:r>
+        <w:rPr>
+          <w:b/>
+          <w:bCs/>
+        </w:rPr>
+        <w:t>32</w:t>
+      </w:r>
+      <w:proofErr w:type="gramStart"/>
+      <w:r>
+        <w:rPr>
+          <w:b/>
+          <w:bCs/>
+        </w:rPr>
+        <w:t>BE(</w:t>
+      </w:r>
+      <w:proofErr w:type="gramEnd"/>
+      <w:r>
+        <w:rPr>
+          <w:b/>
+          <w:bCs/>
+        </w:rPr>
+        <w:t xml:space="preserve">) / </w:t>
+      </w:r>
+      <w:proofErr w:type="gramStart"/>
+      <w:r>
+        <w:rPr>
+          <w:b/>
+          <w:bCs/>
+        </w:rPr>
+        <w:t>buf.writeInt</w:t>
+      </w:r>
+      <w:proofErr w:type="gramEnd"/>
+      <w:r>
+        <w:rPr>
+          <w:b/>
+          <w:bCs/>
+        </w:rPr>
+        <w:t>32</w:t>
+      </w:r>
+      <w:proofErr w:type="gramStart"/>
+      <w:r>
+        <w:rPr>
+          <w:b/>
+          <w:bCs/>
+        </w:rPr>
+        <w:t>BE(</w:t>
+      </w:r>
+      <w:proofErr w:type="gramEnd"/>
+      <w:r>
+        <w:rPr>
+          <w:b/>
+          <w:bCs/>
+        </w:rPr>
+        <w:t>)</w:t>
+      </w:r>
+      <w:r>
+        <w:t>: High-level utility methods used to read or write specific integer types using Endian architecture formats. [</w:t>
+      </w:r>
+      <w:hyperlink r:id="rId49" w:history="1">
+        <w:r>
+          <w:rPr>
+            <w:rStyle w:val="Hyperlink"/>
+          </w:rPr>
+          <w:t>1</w:t>
+        </w:r>
+      </w:hyperlink>
+      <w:r>
+        <w:t xml:space="preserve">, </w:t>
+      </w:r>
+      <w:hyperlink r:id="rId50" w:history="1">
+        <w:r>
+          <w:rPr>
+            <w:rStyle w:val="Hyperlink"/>
+          </w:rPr>
+          <w:t>2</w:t>
+        </w:r>
+      </w:hyperlink>
+      <w:r>
+        <w:t xml:space="preserve">, </w:t>
+      </w:r>
+      <w:hyperlink r:id="rId51" w:history="1">
+        <w:r>
+          <w:rPr>
+            <w:rStyle w:val="Hyperlink"/>
+          </w:rPr>
+          <w:t>3</w:t>
+        </w:r>
+      </w:hyperlink>
+      <w:r>
+        <w:t xml:space="preserve">, </w:t>
+      </w:r>
+      <w:hyperlink r:id="rId52" w:history="1">
+        <w:r>
+          <w:rPr>
+            <w:rStyle w:val="Hyperlink"/>
+          </w:rPr>
+          <w:t>4</w:t>
+        </w:r>
+      </w:hyperlink>
+      <w:r>
+        <w:t xml:space="preserve">, </w:t>
+      </w:r>
+      <w:hyperlink r:id="rId53" w:history="1">
+        <w:r>
+          <w:rPr>
+            <w:rStyle w:val="Hyperlink"/>
+          </w:rPr>
+          <w:t>5</w:t>
+        </w:r>
+      </w:hyperlink>
+      <w:r>
+        <w:t xml:space="preserve">, </w:t>
+      </w:r>
+      <w:hyperlink r:id="rId54" w:history="1">
+        <w:r>
+          <w:rPr>
+            <w:rStyle w:val="Hyperlink"/>
+          </w:rPr>
+          <w:t>6</w:t>
+        </w:r>
+      </w:hyperlink>
+      <w:r>
+        <w:t>]</w:t>
+      </w:r>
+    </w:p>
+    <w:p>
+      <w:pPr>
+        <w:rPr>
+          <w:b/>
+          <w:bCs/>
+        </w:rPr>
+      </w:pPr>
+      <w:r>
+        <w:rPr>
+          <w:b/>
+          <w:bCs/>
+        </w:rPr>
+        <w:t>Utilities and Comparisons</w:t>
+      </w:r>
+    </w:p>
+    <w:p>
+      <w:pPr>
+        <w:numPr>
+          <w:ilvl w:val="0"/>
+          <w:numId w:val="3"/>
+        </w:numPr>
+      </w:pPr>
+      <w:proofErr w:type="spellStart"/>
+      <w:proofErr w:type="gramStart"/>
+      <w:r>
+        <w:rPr>
+          <w:b/>
+          <w:bCs/>
+        </w:rPr>
+        <w:lastRenderedPageBreak/>
+        <w:t>buf.length</w:t>
+      </w:r>
+      <w:proofErr w:type="spellEnd"/>
+      <w:proofErr w:type="gramEnd"/>
+      <w:r>
+        <w:t>: An instance property returning the total byte capacity assigned to the buffer.</w:t>
+      </w:r>
+    </w:p>
+    <w:p>
+      <w:pPr>
+        <w:numPr>
+          <w:ilvl w:val="0"/>
+          <w:numId w:val="3"/>
+        </w:numPr>
+      </w:pPr>
+      <w:proofErr w:type="spellStart"/>
+      <w:proofErr w:type="gramStart"/>
+      <w:r>
+        <w:rPr>
+          <w:b/>
+          <w:bCs/>
+        </w:rPr>
+        <w:t>buf.copy</w:t>
+      </w:r>
+      <w:proofErr w:type="spellEnd"/>
+      <w:proofErr w:type="gramEnd"/>
+      <w:r>
+        <w:rPr>
+          <w:b/>
+          <w:bCs/>
+        </w:rPr>
+        <w:t>(</w:t>
+      </w:r>
+      <w:proofErr w:type="gramStart"/>
+      <w:r>
+        <w:rPr>
+          <w:b/>
+          <w:bCs/>
+        </w:rPr>
+        <w:t>target[</w:t>
+      </w:r>
+      <w:proofErr w:type="gramEnd"/>
+      <w:r>
+        <w:rPr>
+          <w:b/>
+          <w:bCs/>
+        </w:rPr>
+        <w:t xml:space="preserve">, </w:t>
+      </w:r>
+      <w:proofErr w:type="spellStart"/>
+      <w:proofErr w:type="gramStart"/>
+      <w:r>
+        <w:rPr>
+          <w:b/>
+          <w:bCs/>
+        </w:rPr>
+        <w:t>targetStart</w:t>
+      </w:r>
+      <w:proofErr w:type="spellEnd"/>
+      <w:r>
+        <w:rPr>
+          <w:b/>
+          <w:bCs/>
+        </w:rPr>
+        <w:t>[</w:t>
+      </w:r>
+      <w:proofErr w:type="gramEnd"/>
+      <w:r>
+        <w:rPr>
+          <w:b/>
+          <w:bCs/>
+        </w:rPr>
+        <w:t xml:space="preserve">, </w:t>
+      </w:r>
+      <w:proofErr w:type="spellStart"/>
+      <w:proofErr w:type="gramStart"/>
+      <w:r>
+        <w:rPr>
+          <w:b/>
+          <w:bCs/>
+        </w:rPr>
+        <w:t>sourceStart</w:t>
+      </w:r>
+      <w:proofErr w:type="spellEnd"/>
+      <w:r>
+        <w:rPr>
+          <w:b/>
+          <w:bCs/>
+        </w:rPr>
+        <w:t>[</w:t>
+      </w:r>
+      <w:proofErr w:type="gramEnd"/>
+      <w:r>
+        <w:rPr>
+          <w:b/>
+          <w:bCs/>
+        </w:rPr>
+        <w:t xml:space="preserve">, </w:t>
+      </w:r>
+      <w:proofErr w:type="spellStart"/>
+      <w:proofErr w:type="gramStart"/>
+      <w:r>
+        <w:rPr>
+          <w:b/>
+          <w:bCs/>
+        </w:rPr>
+        <w:t>sourceEnd</w:t>
+      </w:r>
+      <w:proofErr w:type="spellEnd"/>
+      <w:r>
+        <w:rPr>
+          <w:b/>
+          <w:bCs/>
+        </w:rPr>
+        <w:t>]]</w:t>
+      </w:r>
+      <w:proofErr w:type="gramEnd"/>
+      <w:r>
+        <w:rPr>
+          <w:b/>
+          <w:bCs/>
+        </w:rPr>
+        <w:t>])</w:t>
+      </w:r>
+      <w:r>
+        <w:t>: Copies a block of bytes from one buffer into another target buffer without creating a completely new object.</w:t>
+      </w:r>
+    </w:p>
+    <w:p>
+      <w:pPr>
+        <w:numPr>
+          <w:ilvl w:val="0"/>
+          <w:numId w:val="3"/>
+        </w:numPr>
+      </w:pPr>
+      <w:proofErr w:type="spellStart"/>
+      <w:proofErr w:type="gramStart"/>
+      <w:r>
+        <w:rPr>
+          <w:b/>
+          <w:bCs/>
+        </w:rPr>
+        <w:t>buf.subarray</w:t>
+      </w:r>
+      <w:proofErr w:type="spellEnd"/>
+      <w:proofErr w:type="gramEnd"/>
+      <w:r>
+        <w:rPr>
+          <w:b/>
+          <w:bCs/>
+        </w:rPr>
+        <w:t>([</w:t>
+      </w:r>
+      <w:proofErr w:type="gramStart"/>
+      <w:r>
+        <w:rPr>
+          <w:b/>
+          <w:bCs/>
+        </w:rPr>
+        <w:t>start[</w:t>
+      </w:r>
+      <w:proofErr w:type="gramEnd"/>
+      <w:r>
+        <w:rPr>
+          <w:b/>
+          <w:bCs/>
+        </w:rPr>
+        <w:t>, end]])</w:t>
+      </w:r>
+      <w:r>
+        <w:t>: Returns a specific portion of the buffer's contents while sharing the original memory allocation. [</w:t>
+      </w:r>
+      <w:hyperlink r:id="rId55" w:history="1">
+        <w:r>
+          <w:rPr>
+            <w:rStyle w:val="Hyperlink"/>
+          </w:rPr>
+          <w:t>1</w:t>
+        </w:r>
+      </w:hyperlink>
+      <w:r>
+        <w:t xml:space="preserve">, </w:t>
+      </w:r>
+      <w:hyperlink r:id="rId56" w:history="1">
+        <w:r>
+          <w:rPr>
+            <w:rStyle w:val="Hyperlink"/>
+          </w:rPr>
+          <w:t>2</w:t>
+        </w:r>
+      </w:hyperlink>
+      <w:r>
+        <w:t xml:space="preserve">, </w:t>
+      </w:r>
+      <w:hyperlink r:id="rId57" w:history="1">
+        <w:r>
+          <w:rPr>
+            <w:rStyle w:val="Hyperlink"/>
+          </w:rPr>
+          <w:t>3</w:t>
+        </w:r>
+      </w:hyperlink>
+      <w:r>
+        <w:t xml:space="preserve">, </w:t>
+      </w:r>
+      <w:hyperlink r:id="rId58" w:history="1">
+        <w:r>
+          <w:rPr>
+            <w:rStyle w:val="Hyperlink"/>
+          </w:rPr>
+          <w:t>4</w:t>
+        </w:r>
+      </w:hyperlink>
+      <w:r>
+        <w:t xml:space="preserve">, </w:t>
+      </w:r>
+      <w:hyperlink r:id="rId59" w:history="1">
+        <w:r>
+          <w:rPr>
+            <w:rStyle w:val="Hyperlink"/>
+          </w:rPr>
+          <w:t>5</w:t>
+        </w:r>
+      </w:hyperlink>
+      <w:r>
+        <w:t>]</w:t>
+      </w:r>
+    </w:p>
+    <w:p>
+      <w:r>
+        <w:pict w14:anchorId="613D9A70">
+          <v:rect id="_x0000_i1052" style="width:0;height:1.5pt" o:hralign="center" o:hrstd="t" o:hr="t" fillcolor="#a0a0a0" stroked="f"/>
+        </w:pict>
+      </w:r>
+    </w:p>
+    <w:p>
+      <w:r>
+        <w:t>If you are currently debugging or building a system, let me know:</w:t>
+      </w:r>
+    </w:p>
+    <w:p>
+      <w:pPr>
+        <w:numPr>
+          <w:ilvl w:val="0"/>
+          <w:numId w:val="4"/>
+        </w:numPr>
+      </w:pPr>
+      <w:r>
+        <w:t xml:space="preserve">What </w:t>
+      </w:r>
+      <w:r>
+        <w:rPr>
+          <w:b/>
+          <w:bCs/>
+        </w:rPr>
+        <w:t>data type</w:t>
+      </w:r>
+      <w:r>
+        <w:t xml:space="preserve"> you are processing (e.g., text, images, or network streams)?</w:t>
+      </w:r>
+    </w:p>
+    <w:p>
+      <w:pPr>
+        <w:numPr>
+          <w:ilvl w:val="0"/>
+          <w:numId w:val="4"/>
+        </w:numPr>
+      </w:pPr>
+      <w:r>
+        <w:t xml:space="preserve">Whether you need to optimize for </w:t>
+      </w:r>
+      <w:r>
+        <w:rPr>
+          <w:b/>
+          <w:bCs/>
+        </w:rPr>
+        <w:t>high-speed performance</w:t>
+      </w:r>
+      <w:r>
+        <w:t xml:space="preserve"> or </w:t>
+      </w:r>
+      <w:r>
+        <w:rPr>
+          <w:b/>
+          <w:bCs/>
+        </w:rPr>
+        <w:t>memory safety</w:t>
+      </w:r>
+      <w:r>
+        <w:t>?</w:t>
+      </w:r>
+    </w:p>
+    <w:p>
+      <w:r>
+        <w:t>I can provide the exact code implementation for your scenario.</w:t>
+      </w:r>
+    </w:p>
+    <w:p/>
     <w:sectPr>
       <w:pgSz w:w="12240" w:h="15840"/>
       <w:pgMar w:top="1440" w:right="1440" w:bottom="1440" w:left="1440" w:header="720" w:footer="720" w:gutter="0"/>
@@ -1162,6 +2778,619 @@
     </w:sectPr>
   </w:body>
 </w:document>
+</file>
+
+<file path=word/numbering.xml><?xml version="1.0" encoding="utf-8"?>
+<w:numbering xmlns:wpc="http://schemas.microsoft.com/office/word/2010/wordprocessingCanvas" xmlns:cx="http://schemas.microsoft.com/office/drawing/2014/chartex" xmlns:cx1="http://schemas.microsoft.com/office/drawing/2015/9/8/chartex" xmlns:cx2="http://schemas.microsoft.com/office/drawing/2015/10/21/chartex" xmlns:cx3="http://schemas.microsoft.com/office/drawing/2016/5/9/chartex" xmlns:cx4="http://schemas.microsoft.com/office/drawing/2016/5/10/chartex" xmlns:cx5="http://schemas.microsoft.com/office/drawing/2016/5/11/chartex" xmlns:cx6="http://schemas.microsoft.com/office/drawing/2016/5/12/chartex" xmlns:cx7="http://schemas.microsoft.com/office/drawing/2016/5/13/chartex" xmlns:cx8="http://schemas.microsoft.com/office/drawing/2016/5/14/chartex" xmlns:mc="http://schemas.openxmlformats.org/markup-compatibility/2006" xmlns:aink="http://schemas.microsoft.com/office/drawing/2016/ink" xmlns:am3d="http://schemas.microsoft.com/office/drawing/2017/model3d" xmlns:o="urn:schemas-microsoft-com:office:office" xmlns:oel="http://schemas.microsoft.com/office/2019/extlst" xmlns:r="http://schemas.openxmlformats.org/officeDocument/2006/relationships" xmlns:m="http://schemas.openxmlformats.org/officeDocument/2006/math" xmlns:v="urn:schemas-microsoft-com:vml" xmlns:wp14="http://schemas.microsoft.com/office/word/2010/wordprocessingDrawing" xmlns:wp="http://schemas.openxmlformats.org/drawingml/2006/wordprocessingDrawing" xmlns:w10="urn:schemas-microsoft-com:office:word" xmlns:w="http://schemas.openxmlformats.org/wordprocessingml/2006/main" xmlns:w14="http://schemas.microsoft.com/office/word/2010/wordml" xmlns:w15="http://schemas.microsoft.com/office/word/2012/wordml" xmlns:w16cex="http://schemas.microsoft.com/office/word/2018/wordml/cex" xmlns:w16cid="http://schemas.microsoft.com/office/word/2016/wordml/cid" xmlns:w16="http://schemas.microsoft.com/office/word/2018/wordml" xmlns:w16du="http://schemas.microsoft.com/office/word/2023/wordml/word16du" xmlns:w16sdtdh="http://schemas.microsoft.com/office/word/2020/wordml/sdtdatahash" xmlns:w16sdtfl="http://schemas.microsoft.com/office/word/2024/wordml/sdtformatlock" xmlns:w16se="http://schemas.microsoft.com/office/word/2015/wordml/symex" xmlns:wpg="http://schemas.microsoft.com/office/word/2010/wordprocessingGroup" xmlns:wpi="http://schemas.microsoft.com/office/word/2010/wordprocessingInk" xmlns:wne="http://schemas.microsoft.com/office/word/2006/wordml" xmlns:wps="http://schemas.microsoft.com/office/word/2010/wordprocessingShape" mc:Ignorable="w14 w15 w16se w16cid w16 w16cex w16sdtdh w16sdtfl w16du wp14">
+  <w:abstractNum w:abstractNumId="0" w15:restartNumberingAfterBreak="0">
+    <w:nsid w:val="271B7D65"/>
+    <w:multiLevelType w:val="multilevel"/>
+    <w:tmpl w:val="C14E5330"/>
+    <w:lvl w:ilvl="0">
+      <w:start w:val="1"/>
+      <w:numFmt w:val="bullet"/>
+      <w:lvlText w:val=""/>
+      <w:lvlJc w:val="left"/>
+      <w:pPr>
+        <w:tabs>
+          <w:tab w:val="num" w:pos="720"/>
+        </w:tabs>
+        <w:ind w:left="720" w:hanging="360"/>
+      </w:pPr>
+      <w:rPr>
+        <w:rFonts w:ascii="Symbol" w:hAnsi="Symbol" w:hint="default"/>
+        <w:sz w:val="20"/>
+      </w:rPr>
+    </w:lvl>
+    <w:lvl w:ilvl="1" w:tentative="1">
+      <w:start w:val="1"/>
+      <w:numFmt w:val="bullet"/>
+      <w:lvlText w:val="o"/>
+      <w:lvlJc w:val="left"/>
+      <w:pPr>
+        <w:tabs>
+          <w:tab w:val="num" w:pos="1440"/>
+        </w:tabs>
+        <w:ind w:left="1440" w:hanging="360"/>
+      </w:pPr>
+      <w:rPr>
+        <w:rFonts w:ascii="Courier New" w:hAnsi="Courier New" w:hint="default"/>
+        <w:sz w:val="20"/>
+      </w:rPr>
+    </w:lvl>
+    <w:lvl w:ilvl="2" w:tentative="1">
+      <w:start w:val="1"/>
+      <w:numFmt w:val="bullet"/>
+      <w:lvlText w:val=""/>
+      <w:lvlJc w:val="left"/>
+      <w:pPr>
+        <w:tabs>
+          <w:tab w:val="num" w:pos="2160"/>
+        </w:tabs>
+        <w:ind w:left="2160" w:hanging="360"/>
+      </w:pPr>
+      <w:rPr>
+        <w:rFonts w:ascii="Wingdings" w:hAnsi="Wingdings" w:hint="default"/>
+        <w:sz w:val="20"/>
+      </w:rPr>
+    </w:lvl>
+    <w:lvl w:ilvl="3" w:tentative="1">
+      <w:start w:val="1"/>
+      <w:numFmt w:val="bullet"/>
+      <w:lvlText w:val=""/>
+      <w:lvlJc w:val="left"/>
+      <w:pPr>
+        <w:tabs>
+          <w:tab w:val="num" w:pos="2880"/>
+        </w:tabs>
+        <w:ind w:left="2880" w:hanging="360"/>
+      </w:pPr>
+      <w:rPr>
+        <w:rFonts w:ascii="Wingdings" w:hAnsi="Wingdings" w:hint="default"/>
+        <w:sz w:val="20"/>
+      </w:rPr>
+    </w:lvl>
+    <w:lvl w:ilvl="4" w:tentative="1">
+      <w:start w:val="1"/>
+      <w:numFmt w:val="bullet"/>
+      <w:lvlText w:val=""/>
+      <w:lvlJc w:val="left"/>
+      <w:pPr>
+        <w:tabs>
+          <w:tab w:val="num" w:pos="3600"/>
+        </w:tabs>
+        <w:ind w:left="3600" w:hanging="360"/>
+      </w:pPr>
+      <w:rPr>
+        <w:rFonts w:ascii="Wingdings" w:hAnsi="Wingdings" w:hint="default"/>
+        <w:sz w:val="20"/>
+      </w:rPr>
+    </w:lvl>
+    <w:lvl w:ilvl="5" w:tentative="1">
+      <w:start w:val="1"/>
+      <w:numFmt w:val="bullet"/>
+      <w:lvlText w:val=""/>
+      <w:lvlJc w:val="left"/>
+      <w:pPr>
+        <w:tabs>
+          <w:tab w:val="num" w:pos="4320"/>
+        </w:tabs>
+        <w:ind w:left="4320" w:hanging="360"/>
+      </w:pPr>
+      <w:rPr>
+        <w:rFonts w:ascii="Wingdings" w:hAnsi="Wingdings" w:hint="default"/>
+        <w:sz w:val="20"/>
+      </w:rPr>
+    </w:lvl>
+    <w:lvl w:ilvl="6" w:tentative="1">
+      <w:start w:val="1"/>
+      <w:numFmt w:val="bullet"/>
+      <w:lvlText w:val=""/>
+      <w:lvlJc w:val="left"/>
+      <w:pPr>
+        <w:tabs>
+          <w:tab w:val="num" w:pos="5040"/>
+        </w:tabs>
+        <w:ind w:left="5040" w:hanging="360"/>
+      </w:pPr>
+      <w:rPr>
+        <w:rFonts w:ascii="Wingdings" w:hAnsi="Wingdings" w:hint="default"/>
+        <w:sz w:val="20"/>
+      </w:rPr>
+    </w:lvl>
+    <w:lvl w:ilvl="7" w:tentative="1">
+      <w:start w:val="1"/>
+      <w:numFmt w:val="bullet"/>
+      <w:lvlText w:val=""/>
+      <w:lvlJc w:val="left"/>
+      <w:pPr>
+        <w:tabs>
+          <w:tab w:val="num" w:pos="5760"/>
+        </w:tabs>
+        <w:ind w:left="5760" w:hanging="360"/>
+      </w:pPr>
+      <w:rPr>
+        <w:rFonts w:ascii="Wingdings" w:hAnsi="Wingdings" w:hint="default"/>
+        <w:sz w:val="20"/>
+      </w:rPr>
+    </w:lvl>
+    <w:lvl w:ilvl="8" w:tentative="1">
+      <w:start w:val="1"/>
+      <w:numFmt w:val="bullet"/>
+      <w:lvlText w:val=""/>
+      <w:lvlJc w:val="left"/>
+      <w:pPr>
+        <w:tabs>
+          <w:tab w:val="num" w:pos="6480"/>
+        </w:tabs>
+        <w:ind w:left="6480" w:hanging="360"/>
+      </w:pPr>
+      <w:rPr>
+        <w:rFonts w:ascii="Wingdings" w:hAnsi="Wingdings" w:hint="default"/>
+        <w:sz w:val="20"/>
+      </w:rPr>
+    </w:lvl>
+  </w:abstractNum>
+  <w:abstractNum w:abstractNumId="1" w15:restartNumberingAfterBreak="0">
+    <w:nsid w:val="389C78B2"/>
+    <w:multiLevelType w:val="multilevel"/>
+    <w:tmpl w:val="4C8E37CC"/>
+    <w:lvl w:ilvl="0">
+      <w:start w:val="1"/>
+      <w:numFmt w:val="bullet"/>
+      <w:lvlText w:val=""/>
+      <w:lvlJc w:val="left"/>
+      <w:pPr>
+        <w:tabs>
+          <w:tab w:val="num" w:pos="720"/>
+        </w:tabs>
+        <w:ind w:left="720" w:hanging="360"/>
+      </w:pPr>
+      <w:rPr>
+        <w:rFonts w:ascii="Symbol" w:hAnsi="Symbol" w:hint="default"/>
+        <w:sz w:val="20"/>
+      </w:rPr>
+    </w:lvl>
+    <w:lvl w:ilvl="1" w:tentative="1">
+      <w:start w:val="1"/>
+      <w:numFmt w:val="bullet"/>
+      <w:lvlText w:val="o"/>
+      <w:lvlJc w:val="left"/>
+      <w:pPr>
+        <w:tabs>
+          <w:tab w:val="num" w:pos="1440"/>
+        </w:tabs>
+        <w:ind w:left="1440" w:hanging="360"/>
+      </w:pPr>
+      <w:rPr>
+        <w:rFonts w:ascii="Courier New" w:hAnsi="Courier New" w:hint="default"/>
+        <w:sz w:val="20"/>
+      </w:rPr>
+    </w:lvl>
+    <w:lvl w:ilvl="2" w:tentative="1">
+      <w:start w:val="1"/>
+      <w:numFmt w:val="bullet"/>
+      <w:lvlText w:val=""/>
+      <w:lvlJc w:val="left"/>
+      <w:pPr>
+        <w:tabs>
+          <w:tab w:val="num" w:pos="2160"/>
+        </w:tabs>
+        <w:ind w:left="2160" w:hanging="360"/>
+      </w:pPr>
+      <w:rPr>
+        <w:rFonts w:ascii="Wingdings" w:hAnsi="Wingdings" w:hint="default"/>
+        <w:sz w:val="20"/>
+      </w:rPr>
+    </w:lvl>
+    <w:lvl w:ilvl="3" w:tentative="1">
+      <w:start w:val="1"/>
+      <w:numFmt w:val="bullet"/>
+      <w:lvlText w:val=""/>
+      <w:lvlJc w:val="left"/>
+      <w:pPr>
+        <w:tabs>
+          <w:tab w:val="num" w:pos="2880"/>
+        </w:tabs>
+        <w:ind w:left="2880" w:hanging="360"/>
+      </w:pPr>
+      <w:rPr>
+        <w:rFonts w:ascii="Wingdings" w:hAnsi="Wingdings" w:hint="default"/>
+        <w:sz w:val="20"/>
+      </w:rPr>
+    </w:lvl>
+    <w:lvl w:ilvl="4" w:tentative="1">
+      <w:start w:val="1"/>
+      <w:numFmt w:val="bullet"/>
+      <w:lvlText w:val=""/>
+      <w:lvlJc w:val="left"/>
+      <w:pPr>
+        <w:tabs>
+          <w:tab w:val="num" w:pos="3600"/>
+        </w:tabs>
+        <w:ind w:left="3600" w:hanging="360"/>
+      </w:pPr>
+      <w:rPr>
+        <w:rFonts w:ascii="Wingdings" w:hAnsi="Wingdings" w:hint="default"/>
+        <w:sz w:val="20"/>
+      </w:rPr>
+    </w:lvl>
+    <w:lvl w:ilvl="5" w:tentative="1">
+      <w:start w:val="1"/>
+      <w:numFmt w:val="bullet"/>
+      <w:lvlText w:val=""/>
+      <w:lvlJc w:val="left"/>
+      <w:pPr>
+        <w:tabs>
+          <w:tab w:val="num" w:pos="4320"/>
+        </w:tabs>
+        <w:ind w:left="4320" w:hanging="360"/>
+      </w:pPr>
+      <w:rPr>
+        <w:rFonts w:ascii="Wingdings" w:hAnsi="Wingdings" w:hint="default"/>
+        <w:sz w:val="20"/>
+      </w:rPr>
+    </w:lvl>
+    <w:lvl w:ilvl="6" w:tentative="1">
+      <w:start w:val="1"/>
+      <w:numFmt w:val="bullet"/>
+      <w:lvlText w:val=""/>
+      <w:lvlJc w:val="left"/>
+      <w:pPr>
+        <w:tabs>
+          <w:tab w:val="num" w:pos="5040"/>
+        </w:tabs>
+        <w:ind w:left="5040" w:hanging="360"/>
+      </w:pPr>
+      <w:rPr>
+        <w:rFonts w:ascii="Wingdings" w:hAnsi="Wingdings" w:hint="default"/>
+        <w:sz w:val="20"/>
+      </w:rPr>
+    </w:lvl>
+    <w:lvl w:ilvl="7" w:tentative="1">
+      <w:start w:val="1"/>
+      <w:numFmt w:val="bullet"/>
+      <w:lvlText w:val=""/>
+      <w:lvlJc w:val="left"/>
+      <w:pPr>
+        <w:tabs>
+          <w:tab w:val="num" w:pos="5760"/>
+        </w:tabs>
+        <w:ind w:left="5760" w:hanging="360"/>
+      </w:pPr>
+      <w:rPr>
+        <w:rFonts w:ascii="Wingdings" w:hAnsi="Wingdings" w:hint="default"/>
+        <w:sz w:val="20"/>
+      </w:rPr>
+    </w:lvl>
+    <w:lvl w:ilvl="8" w:tentative="1">
+      <w:start w:val="1"/>
+      <w:numFmt w:val="bullet"/>
+      <w:lvlText w:val=""/>
+      <w:lvlJc w:val="left"/>
+      <w:pPr>
+        <w:tabs>
+          <w:tab w:val="num" w:pos="6480"/>
+        </w:tabs>
+        <w:ind w:left="6480" w:hanging="360"/>
+      </w:pPr>
+      <w:rPr>
+        <w:rFonts w:ascii="Wingdings" w:hAnsi="Wingdings" w:hint="default"/>
+        <w:sz w:val="20"/>
+      </w:rPr>
+    </w:lvl>
+  </w:abstractNum>
+  <w:abstractNum w:abstractNumId="2" w15:restartNumberingAfterBreak="0">
+    <w:nsid w:val="480E798E"/>
+    <w:multiLevelType w:val="multilevel"/>
+    <w:tmpl w:val="39CA88CA"/>
+    <w:lvl w:ilvl="0">
+      <w:start w:val="1"/>
+      <w:numFmt w:val="bullet"/>
+      <w:lvlText w:val=""/>
+      <w:lvlJc w:val="left"/>
+      <w:pPr>
+        <w:tabs>
+          <w:tab w:val="num" w:pos="720"/>
+        </w:tabs>
+        <w:ind w:left="720" w:hanging="360"/>
+      </w:pPr>
+      <w:rPr>
+        <w:rFonts w:ascii="Symbol" w:hAnsi="Symbol" w:hint="default"/>
+        <w:sz w:val="20"/>
+      </w:rPr>
+    </w:lvl>
+    <w:lvl w:ilvl="1" w:tentative="1">
+      <w:start w:val="1"/>
+      <w:numFmt w:val="bullet"/>
+      <w:lvlText w:val="o"/>
+      <w:lvlJc w:val="left"/>
+      <w:pPr>
+        <w:tabs>
+          <w:tab w:val="num" w:pos="1440"/>
+        </w:tabs>
+        <w:ind w:left="1440" w:hanging="360"/>
+      </w:pPr>
+      <w:rPr>
+        <w:rFonts w:ascii="Courier New" w:hAnsi="Courier New" w:hint="default"/>
+        <w:sz w:val="20"/>
+      </w:rPr>
+    </w:lvl>
+    <w:lvl w:ilvl="2" w:tentative="1">
+      <w:start w:val="1"/>
+      <w:numFmt w:val="bullet"/>
+      <w:lvlText w:val=""/>
+      <w:lvlJc w:val="left"/>
+      <w:pPr>
+        <w:tabs>
+          <w:tab w:val="num" w:pos="2160"/>
+        </w:tabs>
+        <w:ind w:left="2160" w:hanging="360"/>
+      </w:pPr>
+      <w:rPr>
+        <w:rFonts w:ascii="Wingdings" w:hAnsi="Wingdings" w:hint="default"/>
+        <w:sz w:val="20"/>
+      </w:rPr>
+    </w:lvl>
+    <w:lvl w:ilvl="3" w:tentative="1">
+      <w:start w:val="1"/>
+      <w:numFmt w:val="bullet"/>
+      <w:lvlText w:val=""/>
+      <w:lvlJc w:val="left"/>
+      <w:pPr>
+        <w:tabs>
+          <w:tab w:val="num" w:pos="2880"/>
+        </w:tabs>
+        <w:ind w:left="2880" w:hanging="360"/>
+      </w:pPr>
+      <w:rPr>
+        <w:rFonts w:ascii="Wingdings" w:hAnsi="Wingdings" w:hint="default"/>
+        <w:sz w:val="20"/>
+      </w:rPr>
+    </w:lvl>
+    <w:lvl w:ilvl="4" w:tentative="1">
+      <w:start w:val="1"/>
+      <w:numFmt w:val="bullet"/>
+      <w:lvlText w:val=""/>
+      <w:lvlJc w:val="left"/>
+      <w:pPr>
+        <w:tabs>
+          <w:tab w:val="num" w:pos="3600"/>
+        </w:tabs>
+        <w:ind w:left="3600" w:hanging="360"/>
+      </w:pPr>
+      <w:rPr>
+        <w:rFonts w:ascii="Wingdings" w:hAnsi="Wingdings" w:hint="default"/>
+        <w:sz w:val="20"/>
+      </w:rPr>
+    </w:lvl>
+    <w:lvl w:ilvl="5" w:tentative="1">
+      <w:start w:val="1"/>
+      <w:numFmt w:val="bullet"/>
+      <w:lvlText w:val=""/>
+      <w:lvlJc w:val="left"/>
+      <w:pPr>
+        <w:tabs>
+          <w:tab w:val="num" w:pos="4320"/>
+        </w:tabs>
+        <w:ind w:left="4320" w:hanging="360"/>
+      </w:pPr>
+      <w:rPr>
+        <w:rFonts w:ascii="Wingdings" w:hAnsi="Wingdings" w:hint="default"/>
+        <w:sz w:val="20"/>
+      </w:rPr>
+    </w:lvl>
+    <w:lvl w:ilvl="6" w:tentative="1">
+      <w:start w:val="1"/>
+      <w:numFmt w:val="bullet"/>
+      <w:lvlText w:val=""/>
+      <w:lvlJc w:val="left"/>
+      <w:pPr>
+        <w:tabs>
+          <w:tab w:val="num" w:pos="5040"/>
+        </w:tabs>
+        <w:ind w:left="5040" w:hanging="360"/>
+      </w:pPr>
+      <w:rPr>
+        <w:rFonts w:ascii="Wingdings" w:hAnsi="Wingdings" w:hint="default"/>
+        <w:sz w:val="20"/>
+      </w:rPr>
+    </w:lvl>
+    <w:lvl w:ilvl="7" w:tentative="1">
+      <w:start w:val="1"/>
+      <w:numFmt w:val="bullet"/>
+      <w:lvlText w:val=""/>
+      <w:lvlJc w:val="left"/>
+      <w:pPr>
+        <w:tabs>
+          <w:tab w:val="num" w:pos="5760"/>
+        </w:tabs>
+        <w:ind w:left="5760" w:hanging="360"/>
+      </w:pPr>
+      <w:rPr>
+        <w:rFonts w:ascii="Wingdings" w:hAnsi="Wingdings" w:hint="default"/>
+        <w:sz w:val="20"/>
+      </w:rPr>
+    </w:lvl>
+    <w:lvl w:ilvl="8" w:tentative="1">
+      <w:start w:val="1"/>
+      <w:numFmt w:val="bullet"/>
+      <w:lvlText w:val=""/>
+      <w:lvlJc w:val="left"/>
+      <w:pPr>
+        <w:tabs>
+          <w:tab w:val="num" w:pos="6480"/>
+        </w:tabs>
+        <w:ind w:left="6480" w:hanging="360"/>
+      </w:pPr>
+      <w:rPr>
+        <w:rFonts w:ascii="Wingdings" w:hAnsi="Wingdings" w:hint="default"/>
+        <w:sz w:val="20"/>
+      </w:rPr>
+    </w:lvl>
+  </w:abstractNum>
+  <w:abstractNum w:abstractNumId="3" w15:restartNumberingAfterBreak="0">
+    <w:nsid w:val="6DF34B20"/>
+    <w:multiLevelType w:val="multilevel"/>
+    <w:tmpl w:val="880A89C6"/>
+    <w:lvl w:ilvl="0">
+      <w:start w:val="1"/>
+      <w:numFmt w:val="bullet"/>
+      <w:lvlText w:val=""/>
+      <w:lvlJc w:val="left"/>
+      <w:pPr>
+        <w:tabs>
+          <w:tab w:val="num" w:pos="720"/>
+        </w:tabs>
+        <w:ind w:left="720" w:hanging="360"/>
+      </w:pPr>
+      <w:rPr>
+        <w:rFonts w:ascii="Symbol" w:hAnsi="Symbol" w:hint="default"/>
+        <w:sz w:val="20"/>
+      </w:rPr>
+    </w:lvl>
+    <w:lvl w:ilvl="1" w:tentative="1">
+      <w:start w:val="1"/>
+      <w:numFmt w:val="bullet"/>
+      <w:lvlText w:val="o"/>
+      <w:lvlJc w:val="left"/>
+      <w:pPr>
+        <w:tabs>
+          <w:tab w:val="num" w:pos="1440"/>
+        </w:tabs>
+        <w:ind w:left="1440" w:hanging="360"/>
+      </w:pPr>
+      <w:rPr>
+        <w:rFonts w:ascii="Courier New" w:hAnsi="Courier New" w:hint="default"/>
+        <w:sz w:val="20"/>
+      </w:rPr>
+    </w:lvl>
+    <w:lvl w:ilvl="2" w:tentative="1">
+      <w:start w:val="1"/>
+      <w:numFmt w:val="bullet"/>
+      <w:lvlText w:val=""/>
+      <w:lvlJc w:val="left"/>
+      <w:pPr>
+        <w:tabs>
+          <w:tab w:val="num" w:pos="2160"/>
+        </w:tabs>
+        <w:ind w:left="2160" w:hanging="360"/>
+      </w:pPr>
+      <w:rPr>
+        <w:rFonts w:ascii="Wingdings" w:hAnsi="Wingdings" w:hint="default"/>
+        <w:sz w:val="20"/>
+      </w:rPr>
+    </w:lvl>
+    <w:lvl w:ilvl="3" w:tentative="1">
+      <w:start w:val="1"/>
+      <w:numFmt w:val="bullet"/>
+      <w:lvlText w:val=""/>
+      <w:lvlJc w:val="left"/>
+      <w:pPr>
+        <w:tabs>
+          <w:tab w:val="num" w:pos="2880"/>
+        </w:tabs>
+        <w:ind w:left="2880" w:hanging="360"/>
+      </w:pPr>
+      <w:rPr>
+        <w:rFonts w:ascii="Wingdings" w:hAnsi="Wingdings" w:hint="default"/>
+        <w:sz w:val="20"/>
+      </w:rPr>
+    </w:lvl>
+    <w:lvl w:ilvl="4" w:tentative="1">
+      <w:start w:val="1"/>
+      <w:numFmt w:val="bullet"/>
+      <w:lvlText w:val=""/>
+      <w:lvlJc w:val="left"/>
+      <w:pPr>
+        <w:tabs>
+          <w:tab w:val="num" w:pos="3600"/>
+        </w:tabs>
+        <w:ind w:left="3600" w:hanging="360"/>
+      </w:pPr>
+      <w:rPr>
+        <w:rFonts w:ascii="Wingdings" w:hAnsi="Wingdings" w:hint="default"/>
+        <w:sz w:val="20"/>
+      </w:rPr>
+    </w:lvl>
+    <w:lvl w:ilvl="5" w:tentative="1">
+      <w:start w:val="1"/>
+      <w:numFmt w:val="bullet"/>
+      <w:lvlText w:val=""/>
+      <w:lvlJc w:val="left"/>
+      <w:pPr>
+        <w:tabs>
+          <w:tab w:val="num" w:pos="4320"/>
+        </w:tabs>
+        <w:ind w:left="4320" w:hanging="360"/>
+      </w:pPr>
+      <w:rPr>
+        <w:rFonts w:ascii="Wingdings" w:hAnsi="Wingdings" w:hint="default"/>
+        <w:sz w:val="20"/>
+      </w:rPr>
+    </w:lvl>
+    <w:lvl w:ilvl="6" w:tentative="1">
+      <w:start w:val="1"/>
+      <w:numFmt w:val="bullet"/>
+      <w:lvlText w:val=""/>
+      <w:lvlJc w:val="left"/>
+      <w:pPr>
+        <w:tabs>
+          <w:tab w:val="num" w:pos="5040"/>
+        </w:tabs>
+        <w:ind w:left="5040" w:hanging="360"/>
+      </w:pPr>
+      <w:rPr>
+        <w:rFonts w:ascii="Wingdings" w:hAnsi="Wingdings" w:hint="default"/>
+        <w:sz w:val="20"/>
+      </w:rPr>
+    </w:lvl>
+    <w:lvl w:ilvl="7" w:tentative="1">
+      <w:start w:val="1"/>
+      <w:numFmt w:val="bullet"/>
+      <w:lvlText w:val=""/>
+      <w:lvlJc w:val="left"/>
+      <w:pPr>
+        <w:tabs>
+          <w:tab w:val="num" w:pos="5760"/>
+        </w:tabs>
+        <w:ind w:left="5760" w:hanging="360"/>
+      </w:pPr>
+      <w:rPr>
+        <w:rFonts w:ascii="Wingdings" w:hAnsi="Wingdings" w:hint="default"/>
+        <w:sz w:val="20"/>
+      </w:rPr>
+    </w:lvl>
+    <w:lvl w:ilvl="8" w:tentative="1">
+      <w:start w:val="1"/>
+      <w:numFmt w:val="bullet"/>
+      <w:lvlText w:val=""/>
+      <w:lvlJc w:val="left"/>
+      <w:pPr>
+        <w:tabs>
+          <w:tab w:val="num" w:pos="6480"/>
+        </w:tabs>
+        <w:ind w:left="6480" w:hanging="360"/>
+      </w:pPr>
+      <w:rPr>
+        <w:rFonts w:ascii="Wingdings" w:hAnsi="Wingdings" w:hint="default"/>
+        <w:sz w:val="20"/>
+      </w:rPr>
+    </w:lvl>
+  </w:abstractNum>
+  <w:num w:numId="1" w16cid:durableId="2076198769">
+    <w:abstractNumId w:val="1"/>
+  </w:num>
+  <w:num w:numId="2" w16cid:durableId="1819955767">
+    <w:abstractNumId w:val="3"/>
+  </w:num>
+  <w:num w:numId="3" w16cid:durableId="391273598">
+    <w:abstractNumId w:val="2"/>
+  </w:num>
+  <w:num w:numId="4" w16cid:durableId="1719011286">
+    <w:abstractNumId w:val="0"/>
+  </w:num>
+</w:numbering>
 </file>
 
 <file path=word/styles.xml><?xml version="1.0" encoding="utf-8"?>

</xml_diff>

<commit_message>
Read buffer, write buffer after allocating
</commit_message>
<xml_diff>
--- a/node-js/Buffer Methods.docx
+++ b/node-js/Buffer Methods.docx
@@ -358,21 +358,12 @@
             <w:hideMark/>
           </w:tcPr>
           <w:p>
-            <w:proofErr w:type="spellStart"/>
-            <w:r>
-              <w:rPr>
-                <w:b/>
-                <w:bCs/>
-              </w:rPr>
-              <w:t>Buffer.from</w:t>
-            </w:r>
-            <w:proofErr w:type="spellEnd"/>
-            <w:r>
-              <w:rPr>
-                <w:b/>
-                <w:bCs/>
-              </w:rPr>
-              <w:t>()</w:t>
+            <w:r>
+              <w:rPr>
+                <w:b/>
+                <w:bCs/>
+              </w:rPr>
+              <w:t>Buffer.from()</w:t>
             </w:r>
           </w:p>
         </w:tc>
@@ -416,21 +407,12 @@
             <w:hideMark/>
           </w:tcPr>
           <w:p>
-            <w:proofErr w:type="spellStart"/>
-            <w:r>
-              <w:rPr>
-                <w:b/>
-                <w:bCs/>
-              </w:rPr>
-              <w:t>Buffer.alloc</w:t>
-            </w:r>
-            <w:proofErr w:type="spellEnd"/>
-            <w:r>
-              <w:rPr>
-                <w:b/>
-                <w:bCs/>
-              </w:rPr>
-              <w:t>()</w:t>
+            <w:r>
+              <w:rPr>
+                <w:b/>
+                <w:bCs/>
+              </w:rPr>
+              <w:t>Buffer.alloc()</w:t>
             </w:r>
           </w:p>
         </w:tc>
@@ -474,21 +456,12 @@
             <w:hideMark/>
           </w:tcPr>
           <w:p>
-            <w:proofErr w:type="spellStart"/>
-            <w:r>
-              <w:rPr>
-                <w:b/>
-                <w:bCs/>
-              </w:rPr>
-              <w:t>Buffer.concat</w:t>
-            </w:r>
-            <w:proofErr w:type="spellEnd"/>
-            <w:r>
-              <w:rPr>
-                <w:b/>
-                <w:bCs/>
-              </w:rPr>
-              <w:t>()</w:t>
+            <w:r>
+              <w:rPr>
+                <w:b/>
+                <w:bCs/>
+              </w:rPr>
+              <w:t>Buffer.concat()</w:t>
             </w:r>
           </w:p>
         </w:tc>
@@ -503,15 +476,7 @@
           </w:tcPr>
           <w:p>
             <w:r>
-              <w:t xml:space="preserve">Used to merge multiple small buffer objects into </w:t>
-            </w:r>
-            <w:proofErr w:type="gramStart"/>
-            <w:r>
-              <w:t>a single one</w:t>
-            </w:r>
-            <w:proofErr w:type="gramEnd"/>
-            <w:r>
-              <w:t xml:space="preserve">. </w:t>
+              <w:t xml:space="preserve">Used to merge multiple small buffer objects into a single one. </w:t>
             </w:r>
             <w:r>
               <w:rPr>
@@ -540,23 +505,12 @@
             <w:hideMark/>
           </w:tcPr>
           <w:p>
-            <w:proofErr w:type="spellStart"/>
-            <w:proofErr w:type="gramStart"/>
-            <w:r>
-              <w:rPr>
-                <w:b/>
-                <w:bCs/>
-              </w:rPr>
-              <w:t>buf.write</w:t>
-            </w:r>
-            <w:proofErr w:type="spellEnd"/>
-            <w:proofErr w:type="gramEnd"/>
-            <w:r>
-              <w:rPr>
-                <w:b/>
-                <w:bCs/>
-              </w:rPr>
-              <w:t>()</w:t>
+            <w:r>
+              <w:rPr>
+                <w:b/>
+                <w:bCs/>
+              </w:rPr>
+              <w:t>buf.write()</w:t>
             </w:r>
           </w:p>
         </w:tc>
@@ -600,23 +554,12 @@
             <w:hideMark/>
           </w:tcPr>
           <w:p>
-            <w:proofErr w:type="spellStart"/>
-            <w:proofErr w:type="gramStart"/>
-            <w:r>
-              <w:rPr>
-                <w:b/>
-                <w:bCs/>
-              </w:rPr>
-              <w:t>buf.toString</w:t>
-            </w:r>
-            <w:proofErr w:type="spellEnd"/>
-            <w:proofErr w:type="gramEnd"/>
-            <w:r>
-              <w:rPr>
-                <w:b/>
-                <w:bCs/>
-              </w:rPr>
-              <w:t>()</w:t>
+            <w:r>
+              <w:rPr>
+                <w:b/>
+                <w:bCs/>
+              </w:rPr>
+              <w:t>buf.toString()</w:t>
             </w:r>
           </w:p>
         </w:tc>
@@ -641,23 +584,7 @@
               <w:t>Why:</w:t>
             </w:r>
             <w:r>
-              <w:t xml:space="preserve"> The reverse </w:t>
-            </w:r>
-            <w:proofErr w:type="gramStart"/>
-            <w:r>
-              <w:t>of .from</w:t>
-            </w:r>
-            <w:proofErr w:type="gramEnd"/>
-            <w:r>
-              <w:t xml:space="preserve">() </w:t>
-            </w:r>
-            <w:proofErr w:type="gramStart"/>
-            <w:r>
-              <w:t>or .write</w:t>
-            </w:r>
-            <w:proofErr w:type="gramEnd"/>
-            <w:r>
-              <w:t>()—used to read the resulting data once stream processing finishes.</w:t>
+              <w:t xml:space="preserve"> The reverse of .from() or .write()—used to read the resulting data once stream processing finishes.</w:t>
             </w:r>
           </w:p>
         </w:tc>
@@ -675,23 +602,7 @@
           <w:b/>
           <w:bCs/>
         </w:rPr>
-        <w:t xml:space="preserve">2. Java </w:t>
-      </w:r>
-      <w:proofErr w:type="spellStart"/>
-      <w:r>
-        <w:rPr>
-          <w:b/>
-          <w:bCs/>
-        </w:rPr>
-        <w:t>StringBuffer</w:t>
-      </w:r>
-      <w:proofErr w:type="spellEnd"/>
-      <w:r>
-        <w:rPr>
-          <w:b/>
-          <w:bCs/>
-        </w:rPr>
-        <w:t xml:space="preserve"> Methods (String Manipulation)</w:t>
+        <w:t>2. Java StringBuffer Methods (String Manipulation)</w:t>
       </w:r>
     </w:p>
     <w:p>
@@ -874,22 +785,13 @@
             <w:hideMark/>
           </w:tcPr>
           <w:p>
-            <w:proofErr w:type="gramStart"/>
             <w:r>
               <w:rPr>
                 <w:b/>
                 <w:bCs/>
               </w:rPr>
               <w:lastRenderedPageBreak/>
-              <w:t>append(</w:t>
-            </w:r>
-            <w:proofErr w:type="gramEnd"/>
-            <w:r>
-              <w:rPr>
-                <w:b/>
-                <w:bCs/>
-              </w:rPr>
-              <w:t>)</w:t>
+              <w:t>append()</w:t>
             </w:r>
           </w:p>
         </w:tc>
@@ -933,21 +835,12 @@
             <w:hideMark/>
           </w:tcPr>
           <w:p>
-            <w:proofErr w:type="gramStart"/>
-            <w:r>
-              <w:rPr>
-                <w:b/>
-                <w:bCs/>
-              </w:rPr>
-              <w:t>insert(</w:t>
-            </w:r>
-            <w:proofErr w:type="gramEnd"/>
-            <w:r>
-              <w:rPr>
-                <w:b/>
-                <w:bCs/>
-              </w:rPr>
-              <w:t>)</w:t>
+            <w:r>
+              <w:rPr>
+                <w:b/>
+                <w:bCs/>
+              </w:rPr>
+              <w:t>insert()</w:t>
             </w:r>
           </w:p>
         </w:tc>
@@ -962,15 +855,7 @@
           </w:tcPr>
           <w:p>
             <w:r>
-              <w:t xml:space="preserve">Used to inject a string </w:t>
-            </w:r>
-            <w:proofErr w:type="gramStart"/>
-            <w:r>
-              <w:t>at</w:t>
-            </w:r>
-            <w:proofErr w:type="gramEnd"/>
-            <w:r>
-              <w:t xml:space="preserve"> a specific character index. </w:t>
+              <w:t xml:space="preserve">Used to inject a string at a specific character index. </w:t>
             </w:r>
             <w:r>
               <w:rPr>
@@ -999,21 +884,12 @@
             <w:hideMark/>
           </w:tcPr>
           <w:p>
-            <w:proofErr w:type="gramStart"/>
-            <w:r>
-              <w:rPr>
-                <w:b/>
-                <w:bCs/>
-              </w:rPr>
-              <w:t>reverse(</w:t>
-            </w:r>
-            <w:proofErr w:type="gramEnd"/>
-            <w:r>
-              <w:rPr>
-                <w:b/>
-                <w:bCs/>
-              </w:rPr>
-              <w:t>)</w:t>
+            <w:r>
+              <w:rPr>
+                <w:b/>
+                <w:bCs/>
+              </w:rPr>
+              <w:t>reverse()</w:t>
             </w:r>
           </w:p>
         </w:tc>
@@ -1057,37 +933,12 @@
             <w:hideMark/>
           </w:tcPr>
           <w:p>
-            <w:proofErr w:type="gramStart"/>
-            <w:r>
-              <w:rPr>
-                <w:b/>
-                <w:bCs/>
-              </w:rPr>
-              <w:t>delete(</w:t>
-            </w:r>
-            <w:proofErr w:type="gramEnd"/>
-            <w:r>
-              <w:rPr>
-                <w:b/>
-                <w:bCs/>
-              </w:rPr>
-              <w:t xml:space="preserve">) / </w:t>
-            </w:r>
-            <w:proofErr w:type="gramStart"/>
-            <w:r>
-              <w:rPr>
-                <w:b/>
-                <w:bCs/>
-              </w:rPr>
-              <w:t>replace(</w:t>
-            </w:r>
-            <w:proofErr w:type="gramEnd"/>
-            <w:r>
-              <w:rPr>
-                <w:b/>
-                <w:bCs/>
-              </w:rPr>
-              <w:t>)</w:t>
+            <w:r>
+              <w:rPr>
+                <w:b/>
+                <w:bCs/>
+              </w:rPr>
+              <w:t>delete() / replace()</w:t>
             </w:r>
           </w:p>
         </w:tc>
@@ -1179,19 +1030,8 @@
           <w:sz w:val="32"/>
           <w:szCs w:val="32"/>
         </w:rPr>
-        <w:t xml:space="preserve">buffer methods list vs buffer creation method in node </w:t>
-      </w:r>
-      <w:proofErr w:type="spellStart"/>
-      <w:r>
-        <w:rPr>
-          <w:b/>
-          <w:bCs/>
-          <w:sz w:val="32"/>
-          <w:szCs w:val="32"/>
-        </w:rPr>
-        <w:t>js</w:t>
-      </w:r>
-      <w:proofErr w:type="spellEnd"/>
+        <w:t>buffer methods list vs buffer creation method in node js</w:t>
+      </w:r>
     </w:p>
     <w:p>
       <w:pPr>
@@ -1206,30 +1046,7 @@
           <w:b/>
           <w:bCs/>
         </w:rPr>
-        <w:t>(</w:t>
-      </w:r>
-      <w:r>
-        <w:rPr>
-          <w:b/>
-          <w:bCs/>
-        </w:rPr>
-        <w:t xml:space="preserve">buffer methods list vs buffer creation method in node </w:t>
-      </w:r>
-      <w:proofErr w:type="spellStart"/>
-      <w:r>
-        <w:rPr>
-          <w:b/>
-          <w:bCs/>
-        </w:rPr>
-        <w:t>js</w:t>
-      </w:r>
-      <w:proofErr w:type="spellEnd"/>
-      <w:r>
-        <w:rPr>
-          <w:b/>
-          <w:bCs/>
-        </w:rPr>
-        <w:t xml:space="preserve"> – google - ss)</w:t>
+        <w:t>(buffer methods list vs buffer creation method in node js – google - ss)</w:t>
       </w:r>
     </w:p>
     <w:p>
@@ -1293,7 +1110,7 @@
     <w:p>
       <w:r>
         <w:pict w14:anchorId="3F616D48">
-          <v:rect id="_x0000_i1049" style="width:0;height:1.5pt" o:hralign="center" o:hrstd="t" o:hr="t" fillcolor="#a0a0a0" stroked="f"/>
+          <v:rect id="_x0000_i1025" style="width:0;height:1.5pt" o:hralign="center" o:hrstd="t" o:hr="t" fillcolor="#a0a0a0" stroked="f"/>
         </w:pict>
       </w:r>
     </w:p>
@@ -1543,15 +1360,7 @@
           </w:tcPr>
           <w:p>
             <w:r>
-              <w:t xml:space="preserve">Called on an instantiated buffer object (e.g., </w:t>
-            </w:r>
-            <w:proofErr w:type="spellStart"/>
-            <w:r>
-              <w:t>buf</w:t>
-            </w:r>
-            <w:proofErr w:type="spellEnd"/>
-            <w:r>
-              <w:t>).</w:t>
+              <w:t>Called on an instantiated buffer object (e.g., buf).</w:t>
             </w:r>
           </w:p>
         </w:tc>
@@ -1644,21 +1453,8 @@
             <w:hideMark/>
           </w:tcPr>
           <w:p>
-            <w:proofErr w:type="spellStart"/>
-            <w:r>
-              <w:t>Buffer.alloc</w:t>
-            </w:r>
-            <w:proofErr w:type="spellEnd"/>
-            <w:r>
-              <w:t xml:space="preserve">(), </w:t>
-            </w:r>
-            <w:proofErr w:type="spellStart"/>
-            <w:r>
-              <w:t>Buffer.from</w:t>
-            </w:r>
-            <w:proofErr w:type="spellEnd"/>
-            <w:r>
-              <w:t>()</w:t>
+            <w:r>
+              <w:t>Buffer.alloc(), Buffer.from()</w:t>
             </w:r>
           </w:p>
         </w:tc>
@@ -1672,35 +1468,8 @@
             <w:hideMark/>
           </w:tcPr>
           <w:p>
-            <w:proofErr w:type="spellStart"/>
-            <w:proofErr w:type="gramStart"/>
-            <w:r>
-              <w:t>buf.toString</w:t>
-            </w:r>
-            <w:proofErr w:type="spellEnd"/>
-            <w:proofErr w:type="gramEnd"/>
-            <w:r>
-              <w:t xml:space="preserve">(), </w:t>
-            </w:r>
-            <w:proofErr w:type="spellStart"/>
-            <w:proofErr w:type="gramStart"/>
-            <w:r>
-              <w:t>buf.write</w:t>
-            </w:r>
-            <w:proofErr w:type="spellEnd"/>
-            <w:proofErr w:type="gramEnd"/>
-            <w:r>
-              <w:t xml:space="preserve">(), </w:t>
-            </w:r>
-            <w:proofErr w:type="spellStart"/>
-            <w:proofErr w:type="gramStart"/>
-            <w:r>
-              <w:t>buf.slice</w:t>
-            </w:r>
-            <w:proofErr w:type="spellEnd"/>
-            <w:proofErr w:type="gramEnd"/>
-            <w:r>
-              <w:t>()</w:t>
+            <w:r>
+              <w:t>buf.toString(), buf.write(), buf.slice()</w:t>
             </w:r>
           </w:p>
         </w:tc>
@@ -1709,7 +1478,7 @@
     <w:p>
       <w:r>
         <w:pict w14:anchorId="17AA4BD5">
-          <v:rect id="_x0000_i1050" style="width:0;height:1.5pt" o:hralign="center" o:hrstd="t" o:hr="t" fillcolor="#a0a0a0" stroked="f"/>
+          <v:rect id="_x0000_i1026" style="width:0;height:1.5pt" o:hralign="center" o:hrstd="t" o:hr="t" fillcolor="#a0a0a0" stroked="f"/>
         </w:pict>
       </w:r>
     </w:p>
@@ -1795,53 +1564,12 @@
           <w:numId w:val="1"/>
         </w:numPr>
       </w:pPr>
-      <w:proofErr w:type="spellStart"/>
-      <w:r>
-        <w:rPr>
-          <w:b/>
-          <w:bCs/>
-        </w:rPr>
-        <w:t>Buffer.alloc</w:t>
-      </w:r>
-      <w:proofErr w:type="spellEnd"/>
-      <w:r>
-        <w:rPr>
-          <w:b/>
-          <w:bCs/>
-        </w:rPr>
-        <w:t>(</w:t>
-      </w:r>
-      <w:proofErr w:type="gramStart"/>
-      <w:r>
-        <w:rPr>
-          <w:b/>
-          <w:bCs/>
-        </w:rPr>
-        <w:t>size[</w:t>
-      </w:r>
-      <w:proofErr w:type="gramEnd"/>
-      <w:r>
-        <w:rPr>
-          <w:b/>
-          <w:bCs/>
-        </w:rPr>
-        <w:t xml:space="preserve">, </w:t>
-      </w:r>
-      <w:proofErr w:type="gramStart"/>
-      <w:r>
-        <w:rPr>
-          <w:b/>
-          <w:bCs/>
-        </w:rPr>
-        <w:t>fill[</w:t>
-      </w:r>
-      <w:proofErr w:type="gramEnd"/>
-      <w:r>
-        <w:rPr>
-          <w:b/>
-          <w:bCs/>
-        </w:rPr>
-        <w:t>, encoding]])</w:t>
+      <w:r>
+        <w:rPr>
+          <w:b/>
+          <w:bCs/>
+        </w:rPr>
+        <w:t>Buffer.alloc(size[, fill[, encoding]])</w:t>
       </w:r>
       <w:r>
         <w:t>: Allocates a clean, zero-filled buffer of a specified size. This is the safest way to initialize a buffer.</w:t>
@@ -1854,32 +1582,15 @@
           <w:numId w:val="1"/>
         </w:numPr>
       </w:pPr>
-      <w:proofErr w:type="spellStart"/>
-      <w:r>
-        <w:rPr>
-          <w:b/>
-          <w:bCs/>
-        </w:rPr>
-        <w:t>Buffer.allocUnsafe</w:t>
-      </w:r>
-      <w:proofErr w:type="spellEnd"/>
-      <w:r>
-        <w:rPr>
-          <w:b/>
-          <w:bCs/>
-        </w:rPr>
-        <w:t>(size)</w:t>
-      </w:r>
-      <w:r>
-        <w:t xml:space="preserve">: Allocates a raw chunk of memory of the specified size. It is faster than </w:t>
-      </w:r>
-      <w:proofErr w:type="spellStart"/>
-      <w:r>
-        <w:t>alloc</w:t>
-      </w:r>
-      <w:proofErr w:type="spellEnd"/>
-      <w:r>
-        <w:t xml:space="preserve"> but contains "dirty" leftover data from previously destroyed memory segments.</w:t>
+      <w:r>
+        <w:rPr>
+          <w:b/>
+          <w:bCs/>
+        </w:rPr>
+        <w:t>Buffer.allocUnsafe(size)</w:t>
+      </w:r>
+      <w:r>
+        <w:t>: Allocates a raw chunk of memory of the specified size. It is faster than alloc but contains "dirty" leftover data from previously destroyed memory segments.</w:t>
       </w:r>
     </w:p>
     <w:p>
@@ -1889,37 +1600,12 @@
           <w:numId w:val="1"/>
         </w:numPr>
       </w:pPr>
-      <w:proofErr w:type="spellStart"/>
-      <w:r>
-        <w:rPr>
-          <w:b/>
-          <w:bCs/>
-        </w:rPr>
-        <w:t>Buffer.from</w:t>
-      </w:r>
-      <w:proofErr w:type="spellEnd"/>
-      <w:r>
-        <w:rPr>
-          <w:b/>
-          <w:bCs/>
-        </w:rPr>
-        <w:t xml:space="preserve">(array | string | buffer | </w:t>
-      </w:r>
-      <w:proofErr w:type="spellStart"/>
-      <w:r>
-        <w:rPr>
-          <w:b/>
-          <w:bCs/>
-        </w:rPr>
-        <w:t>arrayBuffer</w:t>
-      </w:r>
-      <w:proofErr w:type="spellEnd"/>
-      <w:r>
-        <w:rPr>
-          <w:b/>
-          <w:bCs/>
-        </w:rPr>
-        <w:t>)</w:t>
+      <w:r>
+        <w:rPr>
+          <w:b/>
+          <w:bCs/>
+        </w:rPr>
+        <w:t>Buffer.from(array | string | buffer | arrayBuffer)</w:t>
       </w:r>
       <w:r>
         <w:t>: Creates a new buffer populated with a copy of the passed data type (such as transforming a standard string into raw bytes).</w:t>
@@ -1932,112 +1618,71 @@
           <w:numId w:val="1"/>
         </w:numPr>
       </w:pPr>
-      <w:proofErr w:type="spellStart"/>
-      <w:r>
-        <w:rPr>
-          <w:b/>
-          <w:bCs/>
-        </w:rPr>
-        <w:t>Buffer.concat</w:t>
-      </w:r>
-      <w:proofErr w:type="spellEnd"/>
-      <w:r>
-        <w:rPr>
-          <w:b/>
-          <w:bCs/>
-        </w:rPr>
-        <w:t>(</w:t>
-      </w:r>
-      <w:proofErr w:type="gramStart"/>
-      <w:r>
-        <w:rPr>
-          <w:b/>
-          <w:bCs/>
-        </w:rPr>
-        <w:t>list[</w:t>
-      </w:r>
-      <w:proofErr w:type="gramEnd"/>
-      <w:r>
-        <w:rPr>
-          <w:b/>
-          <w:bCs/>
-        </w:rPr>
+      <w:r>
+        <w:rPr>
+          <w:b/>
+          <w:bCs/>
+        </w:rPr>
+        <w:t>Buffer.concat(list[, totalLength])</w:t>
+      </w:r>
+      <w:r>
+        <w:t>: Takes an array of existing buffers and merges them into one single new buffer. [</w:t>
+      </w:r>
+      <w:hyperlink r:id="rId38" w:history="1">
+        <w:r>
+          <w:rPr>
+            <w:rStyle w:val="Hyperlink"/>
+          </w:rPr>
+          <w:t>1</w:t>
+        </w:r>
+      </w:hyperlink>
+      <w:r>
         <w:t xml:space="preserve">, </w:t>
       </w:r>
-      <w:proofErr w:type="spellStart"/>
-      <w:r>
-        <w:rPr>
-          <w:b/>
-          <w:bCs/>
-        </w:rPr>
-        <w:t>totalLength</w:t>
-      </w:r>
-      <w:proofErr w:type="spellEnd"/>
-      <w:r>
-        <w:rPr>
-          <w:b/>
-          <w:bCs/>
-        </w:rPr>
-        <w:t>])</w:t>
-      </w:r>
-      <w:r>
-        <w:t>: Takes an array of existing buffers and merges them into one single new buffer. [</w:t>
-      </w:r>
-      <w:hyperlink r:id="rId38" w:history="1">
-        <w:r>
-          <w:rPr>
-            <w:rStyle w:val="Hyperlink"/>
-          </w:rPr>
-          <w:t>1</w:t>
+      <w:hyperlink r:id="rId39" w:history="1">
+        <w:r>
+          <w:rPr>
+            <w:rStyle w:val="Hyperlink"/>
+          </w:rPr>
+          <w:t>2</w:t>
         </w:r>
       </w:hyperlink>
       <w:r>
         <w:t xml:space="preserve">, </w:t>
       </w:r>
-      <w:hyperlink r:id="rId39" w:history="1">
-        <w:r>
-          <w:rPr>
-            <w:rStyle w:val="Hyperlink"/>
-          </w:rPr>
-          <w:t>2</w:t>
+      <w:hyperlink r:id="rId40" w:history="1">
+        <w:r>
+          <w:rPr>
+            <w:rStyle w:val="Hyperlink"/>
+          </w:rPr>
+          <w:t>3</w:t>
         </w:r>
       </w:hyperlink>
       <w:r>
         <w:t xml:space="preserve">, </w:t>
       </w:r>
-      <w:hyperlink r:id="rId40" w:history="1">
-        <w:r>
-          <w:rPr>
-            <w:rStyle w:val="Hyperlink"/>
-          </w:rPr>
-          <w:t>3</w:t>
+      <w:hyperlink r:id="rId41" w:history="1">
+        <w:r>
+          <w:rPr>
+            <w:rStyle w:val="Hyperlink"/>
+          </w:rPr>
+          <w:t>4</w:t>
         </w:r>
       </w:hyperlink>
       <w:r>
         <w:t xml:space="preserve">, </w:t>
       </w:r>
-      <w:hyperlink r:id="rId41" w:history="1">
-        <w:r>
-          <w:rPr>
-            <w:rStyle w:val="Hyperlink"/>
-          </w:rPr>
-          <w:t>4</w:t>
+      <w:hyperlink r:id="rId42" w:history="1">
+        <w:r>
+          <w:rPr>
+            <w:rStyle w:val="Hyperlink"/>
+          </w:rPr>
+          <w:t>5</w:t>
         </w:r>
       </w:hyperlink>
       <w:r>
         <w:t xml:space="preserve">, </w:t>
       </w:r>
-      <w:hyperlink r:id="rId42" w:history="1">
-        <w:r>
-          <w:rPr>
-            <w:rStyle w:val="Hyperlink"/>
-          </w:rPr>
-          <w:t>5</w:t>
-        </w:r>
-      </w:hyperlink>
-      <w:r>
-        <w:t xml:space="preserve">, </w:t>
-      </w:r>
       <w:hyperlink r:id="rId43" w:history="1">
         <w:r>
           <w:rPr>
@@ -2053,7 +1698,7 @@
     <w:p>
       <w:r>
         <w:pict w14:anchorId="7B2BFAB3">
-          <v:rect id="_x0000_i1051" style="width:0;height:1.5pt" o:hralign="center" o:hrstd="t" o:hr="t" fillcolor="#a0a0a0" stroked="f"/>
+          <v:rect id="_x0000_i1027" style="width:0;height:1.5pt" o:hralign="center" o:hrstd="t" o:hr="t" fillcolor="#a0a0a0" stroked="f"/>
         </w:pict>
       </w:r>
     </w:p>
@@ -2154,71 +1799,12 @@
           <w:numId w:val="2"/>
         </w:numPr>
       </w:pPr>
-      <w:proofErr w:type="spellStart"/>
-      <w:proofErr w:type="gramStart"/>
-      <w:r>
-        <w:rPr>
-          <w:b/>
-          <w:bCs/>
-        </w:rPr>
-        <w:t>buf.write</w:t>
-      </w:r>
-      <w:proofErr w:type="spellEnd"/>
-      <w:proofErr w:type="gramEnd"/>
-      <w:r>
-        <w:rPr>
-          <w:b/>
-          <w:bCs/>
-        </w:rPr>
-        <w:t>(</w:t>
-      </w:r>
-      <w:proofErr w:type="gramStart"/>
-      <w:r>
-        <w:rPr>
-          <w:b/>
-          <w:bCs/>
-        </w:rPr>
-        <w:t>string[</w:t>
-      </w:r>
-      <w:proofErr w:type="gramEnd"/>
-      <w:r>
-        <w:rPr>
-          <w:b/>
-          <w:bCs/>
-        </w:rPr>
-        <w:t xml:space="preserve">, </w:t>
-      </w:r>
-      <w:proofErr w:type="gramStart"/>
-      <w:r>
-        <w:rPr>
-          <w:b/>
-          <w:bCs/>
-        </w:rPr>
-        <w:t>offset[</w:t>
-      </w:r>
-      <w:proofErr w:type="gramEnd"/>
-      <w:r>
-        <w:rPr>
-          <w:b/>
-          <w:bCs/>
-        </w:rPr>
-        <w:t>, length</w:t>
-      </w:r>
-      <w:proofErr w:type="gramStart"/>
-      <w:r>
-        <w:rPr>
-          <w:b/>
-          <w:bCs/>
-        </w:rPr>
-        <w:t>]][</w:t>
-      </w:r>
-      <w:proofErr w:type="gramEnd"/>
-      <w:r>
-        <w:rPr>
-          <w:b/>
-          <w:bCs/>
-        </w:rPr>
-        <w:t>, encoding])</w:t>
+      <w:r>
+        <w:rPr>
+          <w:b/>
+          <w:bCs/>
+        </w:rPr>
+        <w:t>buf.write(string[, offset[, length]][, encoding])</w:t>
       </w:r>
       <w:r>
         <w:t>: Writes a string of characters directly into an existing buffer at a specified starting byte.</w:t>
@@ -2231,71 +1817,12 @@
           <w:numId w:val="2"/>
         </w:numPr>
       </w:pPr>
-      <w:proofErr w:type="spellStart"/>
-      <w:proofErr w:type="gramStart"/>
-      <w:r>
-        <w:rPr>
-          <w:b/>
-          <w:bCs/>
-        </w:rPr>
-        <w:t>buf.toString</w:t>
-      </w:r>
-      <w:proofErr w:type="spellEnd"/>
-      <w:proofErr w:type="gramEnd"/>
-      <w:r>
-        <w:rPr>
-          <w:b/>
-          <w:bCs/>
-        </w:rPr>
-        <w:t>([</w:t>
-      </w:r>
-      <w:proofErr w:type="gramStart"/>
-      <w:r>
-        <w:rPr>
-          <w:b/>
-          <w:bCs/>
-        </w:rPr>
-        <w:t>encoding[</w:t>
-      </w:r>
-      <w:proofErr w:type="gramEnd"/>
-      <w:r>
-        <w:rPr>
-          <w:b/>
-          <w:bCs/>
-        </w:rPr>
-        <w:t xml:space="preserve">, </w:t>
-      </w:r>
-      <w:proofErr w:type="gramStart"/>
-      <w:r>
-        <w:rPr>
-          <w:b/>
-          <w:bCs/>
-        </w:rPr>
-        <w:t>start[</w:t>
-      </w:r>
-      <w:proofErr w:type="gramEnd"/>
-      <w:r>
-        <w:rPr>
-          <w:b/>
-          <w:bCs/>
-        </w:rPr>
-        <w:t xml:space="preserve">, </w:t>
-      </w:r>
-      <w:proofErr w:type="gramStart"/>
-      <w:r>
-        <w:rPr>
-          <w:b/>
-          <w:bCs/>
-        </w:rPr>
-        <w:t>end]]</w:t>
-      </w:r>
-      <w:proofErr w:type="gramEnd"/>
-      <w:r>
-        <w:rPr>
-          <w:b/>
-          <w:bCs/>
-        </w:rPr>
-        <w:t>])</w:t>
+      <w:r>
+        <w:rPr>
+          <w:b/>
+          <w:bCs/>
+        </w:rPr>
+        <w:t>buf.toString([encoding[, start[, end]]])</w:t>
       </w:r>
       <w:r>
         <w:t>: Decodes the buffer's binary contents back into a human-readable string layout.</w:t>
@@ -2308,69 +1835,12 @@
           <w:numId w:val="2"/>
         </w:numPr>
       </w:pPr>
-      <w:proofErr w:type="gramStart"/>
-      <w:r>
-        <w:rPr>
-          <w:b/>
-          <w:bCs/>
-        </w:rPr>
-        <w:t>buf.readInt</w:t>
-      </w:r>
-      <w:proofErr w:type="gramEnd"/>
-      <w:r>
-        <w:rPr>
-          <w:b/>
-          <w:bCs/>
-        </w:rPr>
-        <w:t>32</w:t>
-      </w:r>
-      <w:proofErr w:type="gramStart"/>
-      <w:r>
-        <w:rPr>
-          <w:b/>
-          <w:bCs/>
-        </w:rPr>
-        <w:t>BE(</w:t>
-      </w:r>
-      <w:proofErr w:type="gramEnd"/>
-      <w:r>
-        <w:rPr>
-          <w:b/>
-          <w:bCs/>
-        </w:rPr>
-        <w:t xml:space="preserve">) / </w:t>
-      </w:r>
-      <w:proofErr w:type="gramStart"/>
-      <w:r>
-        <w:rPr>
-          <w:b/>
-          <w:bCs/>
-        </w:rPr>
-        <w:t>buf.writeInt</w:t>
-      </w:r>
-      <w:proofErr w:type="gramEnd"/>
-      <w:r>
-        <w:rPr>
-          <w:b/>
-          <w:bCs/>
-        </w:rPr>
-        <w:t>32</w:t>
-      </w:r>
-      <w:proofErr w:type="gramStart"/>
-      <w:r>
-        <w:rPr>
-          <w:b/>
-          <w:bCs/>
-        </w:rPr>
-        <w:t>BE(</w:t>
-      </w:r>
-      <w:proofErr w:type="gramEnd"/>
-      <w:r>
-        <w:rPr>
-          <w:b/>
-          <w:bCs/>
-        </w:rPr>
-        <w:t>)</w:t>
+      <w:r>
+        <w:rPr>
+          <w:b/>
+          <w:bCs/>
+        </w:rPr>
+        <w:t>buf.readInt32BE() / buf.writeInt32BE()</w:t>
       </w:r>
       <w:r>
         <w:t>: High-level utility methods used to read or write specific integer types using Endian architecture formats. [</w:t>
@@ -2464,8 +1934,6 @@
           <w:numId w:val="3"/>
         </w:numPr>
       </w:pPr>
-      <w:proofErr w:type="spellStart"/>
-      <w:proofErr w:type="gramStart"/>
       <w:r>
         <w:rPr>
           <w:b/>
@@ -2474,8 +1942,6 @@
         <w:lastRenderedPageBreak/>
         <w:t>buf.length</w:t>
       </w:r>
-      <w:proofErr w:type="spellEnd"/>
-      <w:proofErr w:type="gramEnd"/>
       <w:r>
         <w:t>: An instance property returning the total byte capacity assigned to the buffer.</w:t>
       </w:r>
@@ -2487,114 +1953,12 @@
           <w:numId w:val="3"/>
         </w:numPr>
       </w:pPr>
-      <w:proofErr w:type="spellStart"/>
-      <w:proofErr w:type="gramStart"/>
-      <w:r>
-        <w:rPr>
-          <w:b/>
-          <w:bCs/>
-        </w:rPr>
-        <w:t>buf.copy</w:t>
-      </w:r>
-      <w:proofErr w:type="spellEnd"/>
-      <w:proofErr w:type="gramEnd"/>
-      <w:r>
-        <w:rPr>
-          <w:b/>
-          <w:bCs/>
-        </w:rPr>
-        <w:t>(</w:t>
-      </w:r>
-      <w:proofErr w:type="gramStart"/>
-      <w:r>
-        <w:rPr>
-          <w:b/>
-          <w:bCs/>
-        </w:rPr>
-        <w:t>target[</w:t>
-      </w:r>
-      <w:proofErr w:type="gramEnd"/>
-      <w:r>
-        <w:rPr>
-          <w:b/>
-          <w:bCs/>
-        </w:rPr>
-        <w:t xml:space="preserve">, </w:t>
-      </w:r>
-      <w:proofErr w:type="spellStart"/>
-      <w:proofErr w:type="gramStart"/>
-      <w:r>
-        <w:rPr>
-          <w:b/>
-          <w:bCs/>
-        </w:rPr>
-        <w:t>targetStart</w:t>
-      </w:r>
-      <w:proofErr w:type="spellEnd"/>
-      <w:r>
-        <w:rPr>
-          <w:b/>
-          <w:bCs/>
-        </w:rPr>
-        <w:t>[</w:t>
-      </w:r>
-      <w:proofErr w:type="gramEnd"/>
-      <w:r>
-        <w:rPr>
-          <w:b/>
-          <w:bCs/>
-        </w:rPr>
-        <w:t xml:space="preserve">, </w:t>
-      </w:r>
-      <w:proofErr w:type="spellStart"/>
-      <w:proofErr w:type="gramStart"/>
-      <w:r>
-        <w:rPr>
-          <w:b/>
-          <w:bCs/>
-        </w:rPr>
-        <w:t>sourceStart</w:t>
-      </w:r>
-      <w:proofErr w:type="spellEnd"/>
-      <w:r>
-        <w:rPr>
-          <w:b/>
-          <w:bCs/>
-        </w:rPr>
-        <w:t>[</w:t>
-      </w:r>
-      <w:proofErr w:type="gramEnd"/>
-      <w:r>
-        <w:rPr>
-          <w:b/>
-          <w:bCs/>
-        </w:rPr>
-        <w:t xml:space="preserve">, </w:t>
-      </w:r>
-      <w:proofErr w:type="spellStart"/>
-      <w:proofErr w:type="gramStart"/>
-      <w:r>
-        <w:rPr>
-          <w:b/>
-          <w:bCs/>
-        </w:rPr>
-        <w:t>sourceEnd</w:t>
-      </w:r>
-      <w:proofErr w:type="spellEnd"/>
-      <w:r>
-        <w:rPr>
-          <w:b/>
-          <w:bCs/>
-        </w:rPr>
-        <w:t>]]</w:t>
-      </w:r>
-      <w:proofErr w:type="gramEnd"/>
-      <w:r>
-        <w:rPr>
-          <w:b/>
-          <w:bCs/>
-        </w:rPr>
-        <w:t>])</w:t>
+      <w:r>
+        <w:rPr>
+          <w:b/>
+          <w:bCs/>
+        </w:rPr>
+        <w:t>buf.copy(target[, targetStart[, sourceStart[, sourceEnd]]])</w:t>
       </w:r>
       <w:r>
         <w:t>: Copies a block of bytes from one buffer into another target buffer without creating a completely new object.</w:t>
@@ -2607,39 +1971,12 @@
           <w:numId w:val="3"/>
         </w:numPr>
       </w:pPr>
-      <w:proofErr w:type="spellStart"/>
-      <w:proofErr w:type="gramStart"/>
-      <w:r>
-        <w:rPr>
-          <w:b/>
-          <w:bCs/>
-        </w:rPr>
-        <w:t>buf.subarray</w:t>
-      </w:r>
-      <w:proofErr w:type="spellEnd"/>
-      <w:proofErr w:type="gramEnd"/>
-      <w:r>
-        <w:rPr>
-          <w:b/>
-          <w:bCs/>
-        </w:rPr>
-        <w:t>([</w:t>
-      </w:r>
-      <w:proofErr w:type="gramStart"/>
-      <w:r>
-        <w:rPr>
-          <w:b/>
-          <w:bCs/>
-        </w:rPr>
-        <w:t>start[</w:t>
-      </w:r>
-      <w:proofErr w:type="gramEnd"/>
-      <w:r>
-        <w:rPr>
-          <w:b/>
-          <w:bCs/>
-        </w:rPr>
-        <w:t>, end]])</w:t>
+      <w:r>
+        <w:rPr>
+          <w:b/>
+          <w:bCs/>
+        </w:rPr>
+        <w:t>buf.subarray([start[, end]])</w:t>
       </w:r>
       <w:r>
         <w:t>: Returns a specific portion of the buffer's contents while sharing the original memory allocation. [</w:t>
@@ -2703,7 +2040,7 @@
     <w:p>
       <w:r>
         <w:pict w14:anchorId="613D9A70">
-          <v:rect id="_x0000_i1052" style="width:0;height:1.5pt" o:hralign="center" o:hrstd="t" o:hr="t" fillcolor="#a0a0a0" stroked="f"/>
+          <v:rect id="_x0000_i1028" style="width:0;height:1.5pt" o:hralign="center" o:hrstd="t" o:hr="t" fillcolor="#a0a0a0" stroked="f"/>
         </w:pict>
       </w:r>
     </w:p>
@@ -2769,6 +2106,902 @@
         <w:t>I can provide the exact code implementation for your scenario.</w:t>
       </w:r>
     </w:p>
+    <w:p>
+      <w:pPr>
+        <w:pBdr>
+          <w:bottom w:val="dotted" w:sz="24" w:space="1" w:color="auto"/>
+        </w:pBdr>
+      </w:pPr>
+    </w:p>
+    <w:p/>
+    <w:p>
+      <w:pPr>
+        <w:jc w:val="center"/>
+        <w:rPr>
+          <w:b/>
+          <w:bCs/>
+        </w:rPr>
+      </w:pPr>
+      <w:r>
+        <w:rPr>
+          <w:b/>
+          <w:bCs/>
+        </w:rPr>
+        <w:t xml:space="preserve">if Buffer.from() stores a string in buffer memory why </w:t>
+      </w:r>
+      <w:r>
+        <w:rPr>
+          <w:b/>
+          <w:bCs/>
+          <w:color w:val="FF0000"/>
+        </w:rPr>
+        <w:t xml:space="preserve">buff.write() </w:t>
+      </w:r>
+      <w:r>
+        <w:rPr>
+          <w:b/>
+          <w:bCs/>
+        </w:rPr>
+        <w:t>is needed?</w:t>
+      </w:r>
+    </w:p>
+    <w:p>
+      <w:pPr>
+        <w:jc w:val="center"/>
+        <w:rPr>
+          <w:b/>
+          <w:bCs/>
+        </w:rPr>
+      </w:pPr>
+      <w:r>
+        <w:rPr>
+          <w:b/>
+          <w:bCs/>
+        </w:rPr>
+        <w:t>(Buffer from Vs buff write</w:t>
+      </w:r>
+      <w:r>
+        <w:rPr>
+          <w:b/>
+          <w:bCs/>
+        </w:rPr>
+        <w:t xml:space="preserve"> method</w:t>
+      </w:r>
+      <w:r>
+        <w:rPr>
+          <w:b/>
+          <w:bCs/>
+        </w:rPr>
+        <w:t xml:space="preserve"> – google -ss)</w:t>
+      </w:r>
+    </w:p>
+    <w:p/>
+    <w:p>
+      <w:r>
+        <w:rPr>
+          <w:b/>
+          <w:bCs/>
+        </w:rPr>
+        <w:t>Buffer.from() is used to create a new buffer initialized with data, while buf.write() is used to modify or overwrite data inside an existing, already allocated buffer</w:t>
+      </w:r>
+      <w:r>
+        <w:t>. [</w:t>
+      </w:r>
+      <w:hyperlink r:id="rId60" w:history="1">
+        <w:r>
+          <w:rPr>
+            <w:rStyle w:val="Hyperlink"/>
+          </w:rPr>
+          <w:t>1</w:t>
+        </w:r>
+      </w:hyperlink>
+      <w:r>
+        <w:t xml:space="preserve">, </w:t>
+      </w:r>
+      <w:hyperlink r:id="rId61" w:history="1">
+        <w:r>
+          <w:rPr>
+            <w:rStyle w:val="Hyperlink"/>
+          </w:rPr>
+          <w:t>2</w:t>
+        </w:r>
+      </w:hyperlink>
+      <w:r>
+        <w:t>]</w:t>
+      </w:r>
+    </w:p>
+    <w:p>
+      <w:r>
+        <w:t>Think of Buffer.from() as buying a new notebook with text already printed in it, and buf.write() as taking a pen to rewrite or edit pages inside that specific notebook. [</w:t>
+      </w:r>
+      <w:hyperlink r:id="rId62" w:history="1">
+        <w:r>
+          <w:rPr>
+            <w:rStyle w:val="Hyperlink"/>
+          </w:rPr>
+          <w:t>1</w:t>
+        </w:r>
+      </w:hyperlink>
+      <w:r>
+        <w:t xml:space="preserve">, </w:t>
+      </w:r>
+      <w:hyperlink r:id="rId63" w:history="1">
+        <w:r>
+          <w:rPr>
+            <w:rStyle w:val="Hyperlink"/>
+          </w:rPr>
+          <w:t>2</w:t>
+        </w:r>
+      </w:hyperlink>
+      <w:r>
+        <w:t>]</w:t>
+      </w:r>
+    </w:p>
+    <w:p>
+      <w:pPr>
+        <w:rPr>
+          <w:b/>
+          <w:bCs/>
+        </w:rPr>
+      </w:pPr>
+      <w:r>
+        <w:rPr>
+          <w:b/>
+          <w:bCs/>
+        </w:rPr>
+        <w:t>Summary of Differences</w:t>
+      </w:r>
+    </w:p>
+    <w:tbl>
+      <w:tblPr>
+        <w:tblW w:w="0" w:type="auto"/>
+        <w:tblCellSpacing w:w="15" w:type="dxa"/>
+        <w:tblCellMar>
+          <w:top w:w="15" w:type="dxa"/>
+          <w:left w:w="15" w:type="dxa"/>
+          <w:bottom w:w="15" w:type="dxa"/>
+          <w:right w:w="15" w:type="dxa"/>
+        </w:tblCellMar>
+        <w:tblLook w:val="04A0" w:firstRow="1" w:lastRow="0" w:firstColumn="1" w:lastColumn="0" w:noHBand="0" w:noVBand="1"/>
+      </w:tblPr>
+      <w:tblGrid>
+        <w:gridCol w:w="2026"/>
+        <w:gridCol w:w="3684"/>
+        <w:gridCol w:w="3650"/>
+      </w:tblGrid>
+      <w:tr>
+        <w:trPr>
+          <w:tblCellSpacing w:w="15" w:type="dxa"/>
+        </w:trPr>
+        <w:tc>
+          <w:tcPr>
+            <w:tcW w:w="0" w:type="auto"/>
+            <w:tcBorders>
+              <w:bottom w:val="single" w:sz="4" w:space="0" w:color="D2D2D2"/>
+            </w:tcBorders>
+            <w:vAlign w:val="center"/>
+            <w:hideMark/>
+          </w:tcPr>
+          <w:p>
+            <w:pPr>
+              <w:rPr>
+                <w:b/>
+                <w:bCs/>
+              </w:rPr>
+            </w:pPr>
+            <w:r>
+              <w:rPr>
+                <w:b/>
+                <w:bCs/>
+              </w:rPr>
+              <w:t>Feature [</w:t>
+            </w:r>
+            <w:hyperlink r:id="rId64" w:history="1">
+              <w:r>
+                <w:rPr>
+                  <w:rStyle w:val="Hyperlink"/>
+                  <w:b/>
+                  <w:bCs/>
+                </w:rPr>
+                <w:t>1</w:t>
+              </w:r>
+            </w:hyperlink>
+            <w:r>
+              <w:rPr>
+                <w:b/>
+                <w:bCs/>
+              </w:rPr>
+              <w:t xml:space="preserve">, </w:t>
+            </w:r>
+            <w:hyperlink r:id="rId65" w:history="1">
+              <w:r>
+                <w:rPr>
+                  <w:rStyle w:val="Hyperlink"/>
+                  <w:b/>
+                  <w:bCs/>
+                </w:rPr>
+                <w:t>2</w:t>
+              </w:r>
+            </w:hyperlink>
+            <w:r>
+              <w:rPr>
+                <w:b/>
+                <w:bCs/>
+              </w:rPr>
+              <w:t xml:space="preserve">, </w:t>
+            </w:r>
+            <w:hyperlink r:id="rId66" w:history="1">
+              <w:r>
+                <w:rPr>
+                  <w:rStyle w:val="Hyperlink"/>
+                  <w:b/>
+                  <w:bCs/>
+                </w:rPr>
+                <w:t>3</w:t>
+              </w:r>
+            </w:hyperlink>
+            <w:r>
+              <w:rPr>
+                <w:b/>
+                <w:bCs/>
+              </w:rPr>
+              <w:t xml:space="preserve">, </w:t>
+            </w:r>
+            <w:hyperlink r:id="rId67" w:history="1">
+              <w:r>
+                <w:rPr>
+                  <w:rStyle w:val="Hyperlink"/>
+                  <w:b/>
+                  <w:bCs/>
+                </w:rPr>
+                <w:t>4</w:t>
+              </w:r>
+            </w:hyperlink>
+            <w:r>
+              <w:rPr>
+                <w:b/>
+                <w:bCs/>
+              </w:rPr>
+              <w:t xml:space="preserve">, </w:t>
+            </w:r>
+            <w:hyperlink r:id="rId68" w:history="1">
+              <w:r>
+                <w:rPr>
+                  <w:rStyle w:val="Hyperlink"/>
+                  <w:b/>
+                  <w:bCs/>
+                </w:rPr>
+                <w:t>5</w:t>
+              </w:r>
+            </w:hyperlink>
+            <w:r>
+              <w:rPr>
+                <w:b/>
+                <w:bCs/>
+              </w:rPr>
+              <w:t>]</w:t>
+            </w:r>
+          </w:p>
+        </w:tc>
+        <w:tc>
+          <w:tcPr>
+            <w:tcW w:w="0" w:type="auto"/>
+            <w:tcBorders>
+              <w:bottom w:val="single" w:sz="4" w:space="0" w:color="D2D2D2"/>
+            </w:tcBorders>
+            <w:vAlign w:val="center"/>
+            <w:hideMark/>
+          </w:tcPr>
+          <w:p>
+            <w:pPr>
+              <w:rPr>
+                <w:b/>
+                <w:bCs/>
+              </w:rPr>
+            </w:pPr>
+            <w:r>
+              <w:rPr>
+                <w:b/>
+                <w:bCs/>
+              </w:rPr>
+              <w:t>Buffer.from(string)</w:t>
+            </w:r>
+          </w:p>
+        </w:tc>
+        <w:tc>
+          <w:tcPr>
+            <w:tcW w:w="0" w:type="auto"/>
+            <w:tcBorders>
+              <w:bottom w:val="single" w:sz="4" w:space="0" w:color="D2D2D2"/>
+            </w:tcBorders>
+            <w:vAlign w:val="center"/>
+            <w:hideMark/>
+          </w:tcPr>
+          <w:p>
+            <w:pPr>
+              <w:rPr>
+                <w:b/>
+                <w:bCs/>
+              </w:rPr>
+            </w:pPr>
+            <w:r>
+              <w:rPr>
+                <w:b/>
+                <w:bCs/>
+              </w:rPr>
+              <w:t>buf.write(string)</w:t>
+            </w:r>
+          </w:p>
+        </w:tc>
+      </w:tr>
+      <w:tr>
+        <w:trPr>
+          <w:tblCellSpacing w:w="15" w:type="dxa"/>
+        </w:trPr>
+        <w:tc>
+          <w:tcPr>
+            <w:tcW w:w="0" w:type="auto"/>
+            <w:tcBorders>
+              <w:bottom w:val="single" w:sz="4" w:space="0" w:color="D2D2D2"/>
+            </w:tcBorders>
+            <w:vAlign w:val="center"/>
+            <w:hideMark/>
+          </w:tcPr>
+          <w:p>
+            <w:r>
+              <w:rPr>
+                <w:b/>
+                <w:bCs/>
+              </w:rPr>
+              <w:t>Primary Purpose</w:t>
+            </w:r>
+          </w:p>
+        </w:tc>
+        <w:tc>
+          <w:tcPr>
+            <w:tcW w:w="0" w:type="auto"/>
+            <w:tcBorders>
+              <w:bottom w:val="single" w:sz="4" w:space="0" w:color="D2D2D2"/>
+            </w:tcBorders>
+            <w:vAlign w:val="center"/>
+            <w:hideMark/>
+          </w:tcPr>
+          <w:p>
+            <w:r>
+              <w:t>Allocates new memory and fills it.</w:t>
+            </w:r>
+          </w:p>
+        </w:tc>
+        <w:tc>
+          <w:tcPr>
+            <w:tcW w:w="0" w:type="auto"/>
+            <w:tcBorders>
+              <w:bottom w:val="single" w:sz="4" w:space="0" w:color="D2D2D2"/>
+            </w:tcBorders>
+            <w:vAlign w:val="center"/>
+            <w:hideMark/>
+          </w:tcPr>
+          <w:p>
+            <w:r>
+              <w:t>Overwrites bytes in existing memory.</w:t>
+            </w:r>
+          </w:p>
+        </w:tc>
+      </w:tr>
+      <w:tr>
+        <w:trPr>
+          <w:tblCellSpacing w:w="15" w:type="dxa"/>
+        </w:trPr>
+        <w:tc>
+          <w:tcPr>
+            <w:tcW w:w="0" w:type="auto"/>
+            <w:tcBorders>
+              <w:bottom w:val="single" w:sz="4" w:space="0" w:color="D2D2D2"/>
+            </w:tcBorders>
+            <w:vAlign w:val="center"/>
+            <w:hideMark/>
+          </w:tcPr>
+          <w:p>
+            <w:r>
+              <w:rPr>
+                <w:b/>
+                <w:bCs/>
+              </w:rPr>
+              <w:t>Memory Allocation</w:t>
+            </w:r>
+          </w:p>
+        </w:tc>
+        <w:tc>
+          <w:tcPr>
+            <w:tcW w:w="0" w:type="auto"/>
+            <w:tcBorders>
+              <w:bottom w:val="single" w:sz="4" w:space="0" w:color="D2D2D2"/>
+            </w:tcBorders>
+            <w:vAlign w:val="center"/>
+            <w:hideMark/>
+          </w:tcPr>
+          <w:p>
+            <w:r>
+              <w:t>Dynamic (size matches the string length).</w:t>
+            </w:r>
+          </w:p>
+        </w:tc>
+        <w:tc>
+          <w:tcPr>
+            <w:tcW w:w="0" w:type="auto"/>
+            <w:tcBorders>
+              <w:bottom w:val="single" w:sz="4" w:space="0" w:color="D2D2D2"/>
+            </w:tcBorders>
+            <w:vAlign w:val="center"/>
+            <w:hideMark/>
+          </w:tcPr>
+          <w:p>
+            <w:r>
+              <w:t>Static (cannot change the buffer size).</w:t>
+            </w:r>
+          </w:p>
+        </w:tc>
+      </w:tr>
+      <w:tr>
+        <w:trPr>
+          <w:tblCellSpacing w:w="15" w:type="dxa"/>
+        </w:trPr>
+        <w:tc>
+          <w:tcPr>
+            <w:tcW w:w="0" w:type="auto"/>
+            <w:tcBorders>
+              <w:bottom w:val="nil"/>
+            </w:tcBorders>
+            <w:vAlign w:val="center"/>
+            <w:hideMark/>
+          </w:tcPr>
+          <w:p>
+            <w:r>
+              <w:rPr>
+                <w:b/>
+                <w:bCs/>
+              </w:rPr>
+              <w:lastRenderedPageBreak/>
+              <w:t>Performance Impact</w:t>
+            </w:r>
+          </w:p>
+        </w:tc>
+        <w:tc>
+          <w:tcPr>
+            <w:tcW w:w="0" w:type="auto"/>
+            <w:tcBorders>
+              <w:bottom w:val="nil"/>
+            </w:tcBorders>
+            <w:vAlign w:val="center"/>
+            <w:hideMark/>
+          </w:tcPr>
+          <w:p>
+            <w:r>
+              <w:t>Expensive (requests new RAM from the OS).</w:t>
+            </w:r>
+          </w:p>
+        </w:tc>
+        <w:tc>
+          <w:tcPr>
+            <w:tcW w:w="0" w:type="auto"/>
+            <w:tcBorders>
+              <w:bottom w:val="nil"/>
+            </w:tcBorders>
+            <w:vAlign w:val="center"/>
+            <w:hideMark/>
+          </w:tcPr>
+          <w:p>
+            <w:r>
+              <w:t>Cheap (modifies raw bytes directly in place).</w:t>
+            </w:r>
+          </w:p>
+        </w:tc>
+      </w:tr>
+    </w:tbl>
+    <w:p>
+      <w:r>
+        <w:pict w14:anchorId="156C44FD">
+          <v:rect id="_x0000_i1035" style="width:0;height:1.5pt" o:hralign="center" o:hrstd="t" o:hr="t" fillcolor="#a0a0a0" stroked="f"/>
+        </w:pict>
+      </w:r>
+    </w:p>
+    <w:p>
+      <w:pPr>
+        <w:rPr>
+          <w:b/>
+          <w:bCs/>
+        </w:rPr>
+      </w:pPr>
+      <w:r>
+        <w:rPr>
+          <w:b/>
+          <w:bCs/>
+        </w:rPr>
+        <w:t>Why buf.write() Is Necessary</w:t>
+      </w:r>
+    </w:p>
+    <w:p>
+      <w:pPr>
+        <w:rPr>
+          <w:b/>
+          <w:bCs/>
+        </w:rPr>
+      </w:pPr>
+      <w:r>
+        <w:rPr>
+          <w:b/>
+          <w:bCs/>
+        </w:rPr>
+        <w:t>1. Modifying Fixed-Size Memory</w:t>
+      </w:r>
+    </w:p>
+    <w:p>
+      <w:r>
+        <w:t>Once a buffer is allocated in Node.js, its size is fixed and cannot grow or shrink. If you pre-allocated a clean chunk of memory using Buffer.alloc(100), you cannot use Buffer.from() to inject new data into it. You must use buf.write() to insert data into that specific container. [</w:t>
+      </w:r>
+      <w:hyperlink r:id="rId69" w:history="1">
+        <w:r>
+          <w:rPr>
+            <w:rStyle w:val="Hyperlink"/>
+          </w:rPr>
+          <w:t>1</w:t>
+        </w:r>
+      </w:hyperlink>
+      <w:r>
+        <w:t xml:space="preserve">, </w:t>
+      </w:r>
+      <w:hyperlink r:id="rId70" w:history="1">
+        <w:r>
+          <w:rPr>
+            <w:rStyle w:val="Hyperlink"/>
+          </w:rPr>
+          <w:t>2</w:t>
+        </w:r>
+      </w:hyperlink>
+      <w:r>
+        <w:t xml:space="preserve">, </w:t>
+      </w:r>
+      <w:hyperlink r:id="rId71" w:history="1">
+        <w:r>
+          <w:rPr>
+            <w:rStyle w:val="Hyperlink"/>
+          </w:rPr>
+          <w:t>3</w:t>
+        </w:r>
+      </w:hyperlink>
+      <w:r>
+        <w:t xml:space="preserve">, </w:t>
+      </w:r>
+      <w:hyperlink r:id="rId72" w:history="1">
+        <w:r>
+          <w:rPr>
+            <w:rStyle w:val="Hyperlink"/>
+          </w:rPr>
+          <w:t>4</w:t>
+        </w:r>
+      </w:hyperlink>
+      <w:r>
+        <w:t>]</w:t>
+      </w:r>
+    </w:p>
+    <w:p>
+      <w:r>
+        <w:t>javascript</w:t>
+      </w:r>
+    </w:p>
+    <w:p>
+      <w:r>
+        <w:t>// Allocate a clean 10-byte memory space</w:t>
+      </w:r>
+    </w:p>
+    <w:p>
+      <w:r>
+        <w:t xml:space="preserve">const buf = Buffer.alloc(10); </w:t>
+      </w:r>
+    </w:p>
+    <w:p/>
+    <w:p>
+      <w:r>
+        <w:t>// Write "Hi" starting at index 0</w:t>
+      </w:r>
+    </w:p>
+    <w:p>
+      <w:r>
+        <w:t xml:space="preserve">buf.write("Hi"); </w:t>
+      </w:r>
+    </w:p>
+    <w:p>
+      <w:r>
+        <w:t>Use code with caution.</w:t>
+      </w:r>
+    </w:p>
+    <w:p>
+      <w:pPr>
+        <w:rPr>
+          <w:b/>
+          <w:bCs/>
+        </w:rPr>
+      </w:pPr>
+      <w:r>
+        <w:rPr>
+          <w:b/>
+          <w:bCs/>
+        </w:rPr>
+        <w:t>2. Reusing Memory for Performance</w:t>
+      </w:r>
+    </w:p>
+    <w:p>
+      <w:r>
+        <w:t>Creating a new buffer with Buffer.from() forces Node.js to constantly allocate new memory and leaves the old buffers for garbage collection. In high-throughput applications like network servers or database streaming, allocating millions of buffers slows down the application. Reusing a single buffer and overwriting its contents with buf.write() keeps your application highly performant. [</w:t>
+      </w:r>
+      <w:hyperlink r:id="rId73" w:history="1">
+        <w:r>
+          <w:rPr>
+            <w:rStyle w:val="Hyperlink"/>
+          </w:rPr>
+          <w:t>1</w:t>
+        </w:r>
+      </w:hyperlink>
+      <w:r>
+        <w:t xml:space="preserve">, </w:t>
+      </w:r>
+      <w:hyperlink r:id="rId74" w:history="1">
+        <w:r>
+          <w:rPr>
+            <w:rStyle w:val="Hyperlink"/>
+          </w:rPr>
+          <w:t>2</w:t>
+        </w:r>
+      </w:hyperlink>
+      <w:r>
+        <w:t xml:space="preserve">, </w:t>
+      </w:r>
+      <w:hyperlink r:id="rId75" w:history="1">
+        <w:r>
+          <w:rPr>
+            <w:rStyle w:val="Hyperlink"/>
+          </w:rPr>
+          <w:t>3</w:t>
+        </w:r>
+      </w:hyperlink>
+      <w:r>
+        <w:t xml:space="preserve">, </w:t>
+      </w:r>
+      <w:hyperlink r:id="rId76" w:history="1">
+        <w:r>
+          <w:rPr>
+            <w:rStyle w:val="Hyperlink"/>
+          </w:rPr>
+          <w:t>4</w:t>
+        </w:r>
+      </w:hyperlink>
+      <w:r>
+        <w:t xml:space="preserve">, </w:t>
+      </w:r>
+      <w:hyperlink r:id="rId77" w:history="1">
+        <w:r>
+          <w:rPr>
+            <w:rStyle w:val="Hyperlink"/>
+          </w:rPr>
+          <w:t>5</w:t>
+        </w:r>
+      </w:hyperlink>
+      <w:r>
+        <w:t>]</w:t>
+      </w:r>
+    </w:p>
+    <w:p>
+      <w:pPr>
+        <w:rPr>
+          <w:b/>
+          <w:bCs/>
+        </w:rPr>
+      </w:pPr>
+      <w:r>
+        <w:rPr>
+          <w:b/>
+          <w:bCs/>
+        </w:rPr>
+        <w:t>3. Targeted Updates using Offsets [</w:t>
+      </w:r>
+      <w:hyperlink r:id="rId78" w:history="1">
+        <w:r>
+          <w:rPr>
+            <w:rStyle w:val="Hyperlink"/>
+            <w:b/>
+            <w:bCs/>
+          </w:rPr>
+          <w:t>1</w:t>
+        </w:r>
+      </w:hyperlink>
+      <w:r>
+        <w:rPr>
+          <w:b/>
+          <w:bCs/>
+        </w:rPr>
+        <w:t>]</w:t>
+      </w:r>
+    </w:p>
+    <w:p>
+      <w:r>
+        <w:t xml:space="preserve">buf.write() allows you to choose exactly </w:t>
+      </w:r>
+      <w:r>
+        <w:rPr>
+          <w:b/>
+          <w:bCs/>
+        </w:rPr>
+        <w:t>where</w:t>
+      </w:r>
+      <w:r>
+        <w:t xml:space="preserve"> the data should be injected inside the buffer by using offsets. Buffer.from() cannot do this because it always builds a brand new block from scratch. [</w:t>
+      </w:r>
+      <w:hyperlink r:id="rId79" w:history="1">
+        <w:r>
+          <w:rPr>
+            <w:rStyle w:val="Hyperlink"/>
+          </w:rPr>
+          <w:t>1</w:t>
+        </w:r>
+      </w:hyperlink>
+      <w:r>
+        <w:t xml:space="preserve">, </w:t>
+      </w:r>
+      <w:hyperlink r:id="rId80" w:history="1">
+        <w:r>
+          <w:rPr>
+            <w:rStyle w:val="Hyperlink"/>
+          </w:rPr>
+          <w:t>2</w:t>
+        </w:r>
+      </w:hyperlink>
+      <w:r>
+        <w:t xml:space="preserve">, </w:t>
+      </w:r>
+      <w:hyperlink r:id="rId81" w:history="1">
+        <w:r>
+          <w:rPr>
+            <w:rStyle w:val="Hyperlink"/>
+          </w:rPr>
+          <w:t>3</w:t>
+        </w:r>
+      </w:hyperlink>
+      <w:r>
+        <w:t>]</w:t>
+      </w:r>
+    </w:p>
+    <w:p>
+      <w:r>
+        <w:t>javascript</w:t>
+      </w:r>
+    </w:p>
+    <w:p>
+      <w:r>
+        <w:t>const buf = Buffer.from("Hello World"); // [H, e, l, l, o,  , W, o, r, l, d]</w:t>
+      </w:r>
+    </w:p>
+    <w:p/>
+    <w:p>
+      <w:r>
+        <w:lastRenderedPageBreak/>
+        <w:t>// Overwrite "World" with "Nodes" starting at index 6</w:t>
+      </w:r>
+    </w:p>
+    <w:p>
+      <w:r>
+        <w:t>buf.write("Nodes", 6);                  // [H, e, l, l, o,  , N, o, d, e, s]</w:t>
+      </w:r>
+    </w:p>
+    <w:p>
+      <w:r>
+        <w:t>Use code with caution.</w:t>
+      </w:r>
+    </w:p>
+    <w:p>
+      <w:pPr>
+        <w:rPr>
+          <w:b/>
+          <w:bCs/>
+        </w:rPr>
+      </w:pPr>
+      <w:r>
+        <w:rPr>
+          <w:b/>
+          <w:bCs/>
+        </w:rPr>
+        <w:t>4. Handling Network and File Streams</w:t>
+      </w:r>
+    </w:p>
+    <w:p>
+      <w:r>
+        <w:t>When receiving data over a network socket or reading a file chunk-by-chunk, chunks might arrive out of order or staggered. Streams use buf.write() to gradually stitch arriving pieces of a data stream into a single, pre-allocated block of memory. [</w:t>
+      </w:r>
+      <w:hyperlink r:id="rId82" w:history="1">
+        <w:r>
+          <w:rPr>
+            <w:rStyle w:val="Hyperlink"/>
+          </w:rPr>
+          <w:t>1</w:t>
+        </w:r>
+      </w:hyperlink>
+      <w:r>
+        <w:t xml:space="preserve">, </w:t>
+      </w:r>
+      <w:hyperlink r:id="rId83" w:history="1">
+        <w:r>
+          <w:rPr>
+            <w:rStyle w:val="Hyperlink"/>
+          </w:rPr>
+          <w:t>2</w:t>
+        </w:r>
+      </w:hyperlink>
+      <w:r>
+        <w:t>]</w:t>
+      </w:r>
+    </w:p>
+    <w:p>
+      <w:r>
+        <w:t>If you need to explore a particular scenario, let me know:</w:t>
+      </w:r>
+    </w:p>
+    <w:p>
+      <w:pPr>
+        <w:numPr>
+          <w:ilvl w:val="0"/>
+          <w:numId w:val="5"/>
+        </w:numPr>
+      </w:pPr>
+      <w:r>
+        <w:t xml:space="preserve">Are you handling </w:t>
+      </w:r>
+      <w:r>
+        <w:rPr>
+          <w:b/>
+          <w:bCs/>
+        </w:rPr>
+        <w:t>file system streams</w:t>
+      </w:r>
+      <w:r>
+        <w:t xml:space="preserve"> or </w:t>
+      </w:r>
+      <w:r>
+        <w:rPr>
+          <w:b/>
+          <w:bCs/>
+        </w:rPr>
+        <w:t>TCP network data</w:t>
+      </w:r>
+      <w:r>
+        <w:t>?</w:t>
+      </w:r>
+    </w:p>
+    <w:p>
+      <w:pPr>
+        <w:numPr>
+          <w:ilvl w:val="0"/>
+          <w:numId w:val="5"/>
+        </w:numPr>
+      </w:pPr>
+      <w:r>
+        <w:t xml:space="preserve">Do you need to manage </w:t>
+      </w:r>
+      <w:r>
+        <w:rPr>
+          <w:b/>
+          <w:bCs/>
+        </w:rPr>
+        <w:t>binary/hex data formats</w:t>
+      </w:r>
+      <w:r>
+        <w:t xml:space="preserve"> instead of strings?</w:t>
+      </w:r>
+    </w:p>
+    <w:p>
+      <w:r>
+        <w:t>I can provide tailored code structures for your specific project needs.</w:t>
+      </w:r>
+    </w:p>
+    <w:p/>
     <w:p/>
     <w:sectPr>
       <w:pgSz w:w="12240" w:h="15840"/>
@@ -2783,9 +3016,9 @@
 <file path=word/numbering.xml><?xml version="1.0" encoding="utf-8"?>
 <w:numbering xmlns:wpc="http://schemas.microsoft.com/office/word/2010/wordprocessingCanvas" xmlns:cx="http://schemas.microsoft.com/office/drawing/2014/chartex" xmlns:cx1="http://schemas.microsoft.com/office/drawing/2015/9/8/chartex" xmlns:cx2="http://schemas.microsoft.com/office/drawing/2015/10/21/chartex" xmlns:cx3="http://schemas.microsoft.com/office/drawing/2016/5/9/chartex" xmlns:cx4="http://schemas.microsoft.com/office/drawing/2016/5/10/chartex" xmlns:cx5="http://schemas.microsoft.com/office/drawing/2016/5/11/chartex" xmlns:cx6="http://schemas.microsoft.com/office/drawing/2016/5/12/chartex" xmlns:cx7="http://schemas.microsoft.com/office/drawing/2016/5/13/chartex" xmlns:cx8="http://schemas.microsoft.com/office/drawing/2016/5/14/chartex" xmlns:mc="http://schemas.openxmlformats.org/markup-compatibility/2006" xmlns:aink="http://schemas.microsoft.com/office/drawing/2016/ink" xmlns:am3d="http://schemas.microsoft.com/office/drawing/2017/model3d" xmlns:o="urn:schemas-microsoft-com:office:office" xmlns:oel="http://schemas.microsoft.com/office/2019/extlst" xmlns:r="http://schemas.openxmlformats.org/officeDocument/2006/relationships" xmlns:m="http://schemas.openxmlformats.org/officeDocument/2006/math" xmlns:v="urn:schemas-microsoft-com:vml" xmlns:wp14="http://schemas.microsoft.com/office/word/2010/wordprocessingDrawing" xmlns:wp="http://schemas.openxmlformats.org/drawingml/2006/wordprocessingDrawing" xmlns:w10="urn:schemas-microsoft-com:office:word" xmlns:w="http://schemas.openxmlformats.org/wordprocessingml/2006/main" xmlns:w14="http://schemas.microsoft.com/office/word/2010/wordml" xmlns:w15="http://schemas.microsoft.com/office/word/2012/wordml" xmlns:w16cex="http://schemas.microsoft.com/office/word/2018/wordml/cex" xmlns:w16cid="http://schemas.microsoft.com/office/word/2016/wordml/cid" xmlns:w16="http://schemas.microsoft.com/office/word/2018/wordml" xmlns:w16du="http://schemas.microsoft.com/office/word/2023/wordml/word16du" xmlns:w16sdtdh="http://schemas.microsoft.com/office/word/2020/wordml/sdtdatahash" xmlns:w16sdtfl="http://schemas.microsoft.com/office/word/2024/wordml/sdtformatlock" xmlns:w16se="http://schemas.microsoft.com/office/word/2015/wordml/symex" xmlns:wpg="http://schemas.microsoft.com/office/word/2010/wordprocessingGroup" xmlns:wpi="http://schemas.microsoft.com/office/word/2010/wordprocessingInk" xmlns:wne="http://schemas.microsoft.com/office/word/2006/wordml" xmlns:wps="http://schemas.microsoft.com/office/word/2010/wordprocessingShape" mc:Ignorable="w14 w15 w16se w16cid w16 w16cex w16sdtdh w16sdtfl w16du wp14">
   <w:abstractNum w:abstractNumId="0" w15:restartNumberingAfterBreak="0">
-    <w:nsid w:val="271B7D65"/>
+    <w:nsid w:val="242D7FCB"/>
     <w:multiLevelType w:val="multilevel"/>
-    <w:tmpl w:val="C14E5330"/>
+    <w:tmpl w:val="E6D8AF9A"/>
     <w:lvl w:ilvl="0">
       <w:start w:val="1"/>
       <w:numFmt w:val="bullet"/>
@@ -2932,9 +3165,9 @@
     </w:lvl>
   </w:abstractNum>
   <w:abstractNum w:abstractNumId="1" w15:restartNumberingAfterBreak="0">
-    <w:nsid w:val="389C78B2"/>
+    <w:nsid w:val="271B7D65"/>
     <w:multiLevelType w:val="multilevel"/>
-    <w:tmpl w:val="4C8E37CC"/>
+    <w:tmpl w:val="C14E5330"/>
     <w:lvl w:ilvl="0">
       <w:start w:val="1"/>
       <w:numFmt w:val="bullet"/>
@@ -3081,9 +3314,9 @@
     </w:lvl>
   </w:abstractNum>
   <w:abstractNum w:abstractNumId="2" w15:restartNumberingAfterBreak="0">
-    <w:nsid w:val="480E798E"/>
+    <w:nsid w:val="389C78B2"/>
     <w:multiLevelType w:val="multilevel"/>
-    <w:tmpl w:val="39CA88CA"/>
+    <w:tmpl w:val="4C8E37CC"/>
     <w:lvl w:ilvl="0">
       <w:start w:val="1"/>
       <w:numFmt w:val="bullet"/>
@@ -3230,9 +3463,9 @@
     </w:lvl>
   </w:abstractNum>
   <w:abstractNum w:abstractNumId="3" w15:restartNumberingAfterBreak="0">
-    <w:nsid w:val="6DF34B20"/>
+    <w:nsid w:val="480E798E"/>
     <w:multiLevelType w:val="multilevel"/>
-    <w:tmpl w:val="880A89C6"/>
+    <w:tmpl w:val="39CA88CA"/>
     <w:lvl w:ilvl="0">
       <w:start w:val="1"/>
       <w:numFmt w:val="bullet"/>
@@ -3378,16 +3611,168 @@
       </w:rPr>
     </w:lvl>
   </w:abstractNum>
+  <w:abstractNum w:abstractNumId="4" w15:restartNumberingAfterBreak="0">
+    <w:nsid w:val="6DF34B20"/>
+    <w:multiLevelType w:val="multilevel"/>
+    <w:tmpl w:val="880A89C6"/>
+    <w:lvl w:ilvl="0">
+      <w:start w:val="1"/>
+      <w:numFmt w:val="bullet"/>
+      <w:lvlText w:val=""/>
+      <w:lvlJc w:val="left"/>
+      <w:pPr>
+        <w:tabs>
+          <w:tab w:val="num" w:pos="720"/>
+        </w:tabs>
+        <w:ind w:left="720" w:hanging="360"/>
+      </w:pPr>
+      <w:rPr>
+        <w:rFonts w:ascii="Symbol" w:hAnsi="Symbol" w:hint="default"/>
+        <w:sz w:val="20"/>
+      </w:rPr>
+    </w:lvl>
+    <w:lvl w:ilvl="1" w:tentative="1">
+      <w:start w:val="1"/>
+      <w:numFmt w:val="bullet"/>
+      <w:lvlText w:val="o"/>
+      <w:lvlJc w:val="left"/>
+      <w:pPr>
+        <w:tabs>
+          <w:tab w:val="num" w:pos="1440"/>
+        </w:tabs>
+        <w:ind w:left="1440" w:hanging="360"/>
+      </w:pPr>
+      <w:rPr>
+        <w:rFonts w:ascii="Courier New" w:hAnsi="Courier New" w:hint="default"/>
+        <w:sz w:val="20"/>
+      </w:rPr>
+    </w:lvl>
+    <w:lvl w:ilvl="2" w:tentative="1">
+      <w:start w:val="1"/>
+      <w:numFmt w:val="bullet"/>
+      <w:lvlText w:val=""/>
+      <w:lvlJc w:val="left"/>
+      <w:pPr>
+        <w:tabs>
+          <w:tab w:val="num" w:pos="2160"/>
+        </w:tabs>
+        <w:ind w:left="2160" w:hanging="360"/>
+      </w:pPr>
+      <w:rPr>
+        <w:rFonts w:ascii="Wingdings" w:hAnsi="Wingdings" w:hint="default"/>
+        <w:sz w:val="20"/>
+      </w:rPr>
+    </w:lvl>
+    <w:lvl w:ilvl="3" w:tentative="1">
+      <w:start w:val="1"/>
+      <w:numFmt w:val="bullet"/>
+      <w:lvlText w:val=""/>
+      <w:lvlJc w:val="left"/>
+      <w:pPr>
+        <w:tabs>
+          <w:tab w:val="num" w:pos="2880"/>
+        </w:tabs>
+        <w:ind w:left="2880" w:hanging="360"/>
+      </w:pPr>
+      <w:rPr>
+        <w:rFonts w:ascii="Wingdings" w:hAnsi="Wingdings" w:hint="default"/>
+        <w:sz w:val="20"/>
+      </w:rPr>
+    </w:lvl>
+    <w:lvl w:ilvl="4" w:tentative="1">
+      <w:start w:val="1"/>
+      <w:numFmt w:val="bullet"/>
+      <w:lvlText w:val=""/>
+      <w:lvlJc w:val="left"/>
+      <w:pPr>
+        <w:tabs>
+          <w:tab w:val="num" w:pos="3600"/>
+        </w:tabs>
+        <w:ind w:left="3600" w:hanging="360"/>
+      </w:pPr>
+      <w:rPr>
+        <w:rFonts w:ascii="Wingdings" w:hAnsi="Wingdings" w:hint="default"/>
+        <w:sz w:val="20"/>
+      </w:rPr>
+    </w:lvl>
+    <w:lvl w:ilvl="5" w:tentative="1">
+      <w:start w:val="1"/>
+      <w:numFmt w:val="bullet"/>
+      <w:lvlText w:val=""/>
+      <w:lvlJc w:val="left"/>
+      <w:pPr>
+        <w:tabs>
+          <w:tab w:val="num" w:pos="4320"/>
+        </w:tabs>
+        <w:ind w:left="4320" w:hanging="360"/>
+      </w:pPr>
+      <w:rPr>
+        <w:rFonts w:ascii="Wingdings" w:hAnsi="Wingdings" w:hint="default"/>
+        <w:sz w:val="20"/>
+      </w:rPr>
+    </w:lvl>
+    <w:lvl w:ilvl="6" w:tentative="1">
+      <w:start w:val="1"/>
+      <w:numFmt w:val="bullet"/>
+      <w:lvlText w:val=""/>
+      <w:lvlJc w:val="left"/>
+      <w:pPr>
+        <w:tabs>
+          <w:tab w:val="num" w:pos="5040"/>
+        </w:tabs>
+        <w:ind w:left="5040" w:hanging="360"/>
+      </w:pPr>
+      <w:rPr>
+        <w:rFonts w:ascii="Wingdings" w:hAnsi="Wingdings" w:hint="default"/>
+        <w:sz w:val="20"/>
+      </w:rPr>
+    </w:lvl>
+    <w:lvl w:ilvl="7" w:tentative="1">
+      <w:start w:val="1"/>
+      <w:numFmt w:val="bullet"/>
+      <w:lvlText w:val=""/>
+      <w:lvlJc w:val="left"/>
+      <w:pPr>
+        <w:tabs>
+          <w:tab w:val="num" w:pos="5760"/>
+        </w:tabs>
+        <w:ind w:left="5760" w:hanging="360"/>
+      </w:pPr>
+      <w:rPr>
+        <w:rFonts w:ascii="Wingdings" w:hAnsi="Wingdings" w:hint="default"/>
+        <w:sz w:val="20"/>
+      </w:rPr>
+    </w:lvl>
+    <w:lvl w:ilvl="8" w:tentative="1">
+      <w:start w:val="1"/>
+      <w:numFmt w:val="bullet"/>
+      <w:lvlText w:val=""/>
+      <w:lvlJc w:val="left"/>
+      <w:pPr>
+        <w:tabs>
+          <w:tab w:val="num" w:pos="6480"/>
+        </w:tabs>
+        <w:ind w:left="6480" w:hanging="360"/>
+      </w:pPr>
+      <w:rPr>
+        <w:rFonts w:ascii="Wingdings" w:hAnsi="Wingdings" w:hint="default"/>
+        <w:sz w:val="20"/>
+      </w:rPr>
+    </w:lvl>
+  </w:abstractNum>
   <w:num w:numId="1" w16cid:durableId="2076198769">
+    <w:abstractNumId w:val="2"/>
+  </w:num>
+  <w:num w:numId="2" w16cid:durableId="1819955767">
+    <w:abstractNumId w:val="4"/>
+  </w:num>
+  <w:num w:numId="3" w16cid:durableId="391273598">
+    <w:abstractNumId w:val="3"/>
+  </w:num>
+  <w:num w:numId="4" w16cid:durableId="1719011286">
     <w:abstractNumId w:val="1"/>
   </w:num>
-  <w:num w:numId="2" w16cid:durableId="1819955767">
-    <w:abstractNumId w:val="3"/>
-  </w:num>
-  <w:num w:numId="3" w16cid:durableId="391273598">
-    <w:abstractNumId w:val="2"/>
-  </w:num>
-  <w:num w:numId="4" w16cid:durableId="1719011286">
+  <w:num w:numId="5" w16cid:durableId="193005448">
     <w:abstractNumId w:val="0"/>
   </w:num>
 </w:numbering>

</xml_diff>